<commit_message>
Added Functional Requirements On Project Proposal
</commit_message>
<xml_diff>
--- a/Task1_Proposal_717903_Ram_D.docx
+++ b/Task1_Proposal_717903_Ram_D.docx
@@ -3430,11 +3430,9 @@
             <w:r>
               <w:t xml:space="preserve">This will ensure customers know the different products that are offered and their prices. This will allow the client to show </w:t>
             </w:r>
-            <w:proofErr w:type="gramStart"/>
-            <w:r>
-              <w:t>all of</w:t>
-            </w:r>
-            <w:proofErr w:type="gramEnd"/>
+            <w:r>
+              <w:t>all</w:t>
+            </w:r>
             <w:r>
               <w:t xml:space="preserve"> their products to the customers and increase the chance of a purchase being made by the customers.</w:t>
             </w:r>
@@ -3938,7 +3936,13 @@
               </w:numPr>
             </w:pPr>
             <w:r>
-              <w:t>Interact with submit button confirm changes to the product details.</w:t>
+              <w:t xml:space="preserve">Interact with submit button </w:t>
+            </w:r>
+            <w:r>
+              <w:t xml:space="preserve">to </w:t>
+            </w:r>
+            <w:r>
+              <w:t>confirm changes to the product details.</w:t>
             </w:r>
           </w:p>
         </w:tc>
@@ -3998,50 +4002,10 @@
                 <w:numId w:val="17"/>
               </w:numPr>
             </w:pPr>
-          </w:p>
-        </w:tc>
-        <w:tc>
-          <w:tcPr>
-            <w:tcW w:w="2127" w:type="dxa"/>
-          </w:tcPr>
-          <w:p>
-            <w:r>
-              <w:t>This will allow producers to update customers on their orders. And customers will be able to manage their orders. This will benefit the client as the customers will not be frustrated if they do not know their order status. This will also benefit the client in terms of saving money hiring staff to manage order status, since they will not need staff to do this task because it will be done by the application.</w:t>
-            </w:r>
-          </w:p>
-        </w:tc>
-      </w:tr>
-      <w:tr>
-        <w:tc>
-          <w:tcPr>
-            <w:tcW w:w="1980" w:type="dxa"/>
-          </w:tcPr>
-          <w:p>
-            <w:r>
-              <w:t>A loyalty scheme that provides discounts and specials offers</w:t>
-            </w:r>
-          </w:p>
-          <w:p/>
-        </w:tc>
-        <w:tc>
-          <w:tcPr>
-            <w:tcW w:w="2835" w:type="dxa"/>
-          </w:tcPr>
-          <w:p>
-            <w:r>
-              <w:t xml:space="preserve">As Bob, I want to be able to get discounts and special offers, so that I can get rewarded for my loyalty with the business. </w:t>
-            </w:r>
-          </w:p>
-          <w:p>
-            <w:r>
-              <w:t>As Sophie, I want to be able to provide discounts and specials offers, so that I can encourage customers to buy my products more often.</w:t>
-            </w:r>
-          </w:p>
-        </w:tc>
-        <w:tc>
-          <w:tcPr>
-            <w:tcW w:w="2551" w:type="dxa"/>
-          </w:tcPr>
+            <w:r>
+              <w:t>View order history page</w:t>
+            </w:r>
+          </w:p>
           <w:p>
             <w:pPr>
               <w:pStyle w:val="ListParagraph"/>
@@ -4050,49 +4014,10 @@
                 <w:numId w:val="17"/>
               </w:numPr>
             </w:pPr>
-          </w:p>
-        </w:tc>
-        <w:tc>
-          <w:tcPr>
-            <w:tcW w:w="2127" w:type="dxa"/>
-          </w:tcPr>
-          <w:p>
-            <w:r>
-              <w:t xml:space="preserve">This will allow to create a community of loyal customers as their being rewarded for their contribution to the business. Furthermore, having this rewards system will entice new customers to become frequent </w:t>
-            </w:r>
-            <w:r>
-              <w:lastRenderedPageBreak/>
-              <w:t>customers, so they too can get discounted products. This ultimately will allow the client’s business to grow more quickly.</w:t>
-            </w:r>
-          </w:p>
-        </w:tc>
-      </w:tr>
-      <w:tr>
-        <w:tc>
-          <w:tcPr>
-            <w:tcW w:w="1980" w:type="dxa"/>
-          </w:tcPr>
-          <w:p>
-            <w:r>
-              <w:lastRenderedPageBreak/>
-              <w:t>Users able to change the application according to their accessibility needs</w:t>
-            </w:r>
-          </w:p>
-        </w:tc>
-        <w:tc>
-          <w:tcPr>
-            <w:tcW w:w="2835" w:type="dxa"/>
-          </w:tcPr>
-          <w:p>
-            <w:r>
-              <w:t>As Bob, Greg and Sophie, I want to be able to change the application according to my accessibility needs, so that I can use the application comfortably.</w:t>
-            </w:r>
-          </w:p>
-        </w:tc>
-        <w:tc>
-          <w:tcPr>
-            <w:tcW w:w="2551" w:type="dxa"/>
-          </w:tcPr>
+            <w:r>
+              <w:t>View home page</w:t>
+            </w:r>
+          </w:p>
           <w:p>
             <w:pPr>
               <w:pStyle w:val="ListParagraph"/>
@@ -4101,44 +4026,10 @@
                 <w:numId w:val="17"/>
               </w:numPr>
             </w:pPr>
-          </w:p>
-        </w:tc>
-        <w:tc>
-          <w:tcPr>
-            <w:tcW w:w="2127" w:type="dxa"/>
-          </w:tcPr>
-          <w:p>
-            <w:r>
-              <w:t>This will allow users to change the application according to their accessibility needs. For example, text-to-speech, high contrast more, or font size adjusting. This benefit the client as they will have different ages and different ability of customers, and by providing this they will be able to serve them and increase the potential customers they can sell products to.</w:t>
-            </w:r>
-          </w:p>
-        </w:tc>
-      </w:tr>
-      <w:tr>
-        <w:tc>
-          <w:tcPr>
-            <w:tcW w:w="1980" w:type="dxa"/>
-          </w:tcPr>
-          <w:p>
-            <w:r>
-              <w:t>Add access control pages based on user roles</w:t>
-            </w:r>
-          </w:p>
-        </w:tc>
-        <w:tc>
-          <w:tcPr>
-            <w:tcW w:w="2835" w:type="dxa"/>
-          </w:tcPr>
-          <w:p>
-            <w:r>
-              <w:t>As Bob, Greg and Sophie, I want to be able view relevant pages to me, so that I cannot do something that I am not allowed to do.</w:t>
-            </w:r>
-          </w:p>
-        </w:tc>
-        <w:tc>
-          <w:tcPr>
-            <w:tcW w:w="2551" w:type="dxa"/>
-          </w:tcPr>
+            <w:r>
+              <w:t>View order history section on home page</w:t>
+            </w:r>
+          </w:p>
           <w:p>
             <w:pPr>
               <w:pStyle w:val="ListParagraph"/>
@@ -4147,6 +4038,528 @@
                 <w:numId w:val="17"/>
               </w:numPr>
             </w:pPr>
+            <w:r>
+              <w:t>View “All Orders” heading on order history section on home page</w:t>
+            </w:r>
+          </w:p>
+          <w:p>
+            <w:pPr>
+              <w:pStyle w:val="ListParagraph"/>
+              <w:numPr>
+                <w:ilvl w:val="0"/>
+                <w:numId w:val="17"/>
+              </w:numPr>
+            </w:pPr>
+            <w:r>
+              <w:t>Interact with “All Orders” heading to be navigate to the order history page</w:t>
+            </w:r>
+          </w:p>
+          <w:p>
+            <w:pPr>
+              <w:pStyle w:val="ListParagraph"/>
+              <w:numPr>
+                <w:ilvl w:val="0"/>
+                <w:numId w:val="17"/>
+              </w:numPr>
+            </w:pPr>
+            <w:r>
+              <w:t>View order cards on order history page</w:t>
+            </w:r>
+          </w:p>
+          <w:p>
+            <w:pPr>
+              <w:pStyle w:val="ListParagraph"/>
+              <w:numPr>
+                <w:ilvl w:val="0"/>
+                <w:numId w:val="17"/>
+              </w:numPr>
+            </w:pPr>
+            <w:r>
+              <w:t>View order details such as status on order card on order history page</w:t>
+            </w:r>
+          </w:p>
+          <w:p>
+            <w:pPr>
+              <w:pStyle w:val="ListParagraph"/>
+              <w:numPr>
+                <w:ilvl w:val="0"/>
+                <w:numId w:val="17"/>
+              </w:numPr>
+            </w:pPr>
+            <w:r>
+              <w:t>View deny and approve buttons on order cards as a “Admin” or “Producer” user</w:t>
+            </w:r>
+          </w:p>
+          <w:p>
+            <w:pPr>
+              <w:pStyle w:val="ListParagraph"/>
+              <w:numPr>
+                <w:ilvl w:val="0"/>
+                <w:numId w:val="17"/>
+              </w:numPr>
+            </w:pPr>
+            <w:r>
+              <w:t>Interact with deny and approve buttons on cards as a “Admin” or “Producer” user</w:t>
+            </w:r>
+          </w:p>
+        </w:tc>
+        <w:tc>
+          <w:tcPr>
+            <w:tcW w:w="2127" w:type="dxa"/>
+          </w:tcPr>
+          <w:p>
+            <w:r>
+              <w:t>This will allow producers to update customers on their orders. And customers will be able to manage their orders. This will benefit the client as the customers will not be frustrated if they do not know their order status. This will also benefit the client in terms of saving money hiring staff to manage order status, since they will not need staff to do this task because it will be done by the application.</w:t>
+            </w:r>
+          </w:p>
+        </w:tc>
+      </w:tr>
+      <w:tr>
+        <w:tc>
+          <w:tcPr>
+            <w:tcW w:w="1980" w:type="dxa"/>
+          </w:tcPr>
+          <w:p>
+            <w:r>
+              <w:t>A loyalty scheme that provides discounts and specials offers</w:t>
+            </w:r>
+          </w:p>
+          <w:p/>
+        </w:tc>
+        <w:tc>
+          <w:tcPr>
+            <w:tcW w:w="2835" w:type="dxa"/>
+          </w:tcPr>
+          <w:p>
+            <w:r>
+              <w:lastRenderedPageBreak/>
+              <w:t xml:space="preserve">As Bob, I want to be able to get discounts and special offers, so that I can get </w:t>
+            </w:r>
+            <w:r>
+              <w:lastRenderedPageBreak/>
+              <w:t xml:space="preserve">rewarded for my loyalty with the business. </w:t>
+            </w:r>
+          </w:p>
+          <w:p>
+            <w:r>
+              <w:t>As Sophie, I want to be able to provide discounts and specials offers, so that I can encourage customers to buy my products more often.</w:t>
+            </w:r>
+          </w:p>
+        </w:tc>
+        <w:tc>
+          <w:tcPr>
+            <w:tcW w:w="2551" w:type="dxa"/>
+          </w:tcPr>
+          <w:p>
+            <w:r>
+              <w:lastRenderedPageBreak/>
+              <w:t>All users:</w:t>
+            </w:r>
+          </w:p>
+          <w:p>
+            <w:pPr>
+              <w:pStyle w:val="ListParagraph"/>
+              <w:numPr>
+                <w:ilvl w:val="0"/>
+                <w:numId w:val="29"/>
+              </w:numPr>
+            </w:pPr>
+            <w:r>
+              <w:t>View products page</w:t>
+            </w:r>
+          </w:p>
+          <w:p>
+            <w:pPr>
+              <w:pStyle w:val="ListParagraph"/>
+              <w:numPr>
+                <w:ilvl w:val="0"/>
+                <w:numId w:val="29"/>
+              </w:numPr>
+            </w:pPr>
+            <w:r>
+              <w:t>View register page</w:t>
+            </w:r>
+          </w:p>
+          <w:p>
+            <w:pPr>
+              <w:pStyle w:val="ListParagraph"/>
+              <w:numPr>
+                <w:ilvl w:val="0"/>
+                <w:numId w:val="29"/>
+              </w:numPr>
+            </w:pPr>
+            <w:r>
+              <w:t>View log in page</w:t>
+            </w:r>
+          </w:p>
+          <w:p>
+            <w:pPr>
+              <w:pStyle w:val="ListParagraph"/>
+              <w:numPr>
+                <w:ilvl w:val="0"/>
+                <w:numId w:val="29"/>
+              </w:numPr>
+            </w:pPr>
+            <w:r>
+              <w:lastRenderedPageBreak/>
+              <w:t>View product cards on products page</w:t>
+            </w:r>
+          </w:p>
+          <w:p>
+            <w:pPr>
+              <w:pStyle w:val="ListParagraph"/>
+              <w:numPr>
+                <w:ilvl w:val="0"/>
+                <w:numId w:val="29"/>
+              </w:numPr>
+            </w:pPr>
+            <w:r>
+              <w:t>View product basic details on product cards</w:t>
+            </w:r>
+          </w:p>
+          <w:p>
+            <w:pPr>
+              <w:pStyle w:val="ListParagraph"/>
+              <w:numPr>
+                <w:ilvl w:val="0"/>
+                <w:numId w:val="29"/>
+              </w:numPr>
+            </w:pPr>
+            <w:r>
+              <w:t>View product all details on product specific page</w:t>
+            </w:r>
+          </w:p>
+          <w:p>
+            <w:pPr>
+              <w:pStyle w:val="ListParagraph"/>
+              <w:numPr>
+                <w:ilvl w:val="0"/>
+                <w:numId w:val="29"/>
+              </w:numPr>
+            </w:pPr>
+            <w:r>
+              <w:t>View discounts on product prices on product specific page</w:t>
+            </w:r>
+          </w:p>
+          <w:p>
+            <w:r>
+              <w:t>Producer</w:t>
+            </w:r>
+            <w:r>
+              <w:t xml:space="preserve"> users</w:t>
+            </w:r>
+            <w:r>
+              <w:t>:</w:t>
+            </w:r>
+          </w:p>
+          <w:p>
+            <w:pPr>
+              <w:pStyle w:val="ListParagraph"/>
+              <w:numPr>
+                <w:ilvl w:val="0"/>
+                <w:numId w:val="32"/>
+              </w:numPr>
+            </w:pPr>
+            <w:r>
+              <w:t>View discount type field on product</w:t>
+            </w:r>
+            <w:r>
+              <w:t xml:space="preserve"> specific page</w:t>
+            </w:r>
+          </w:p>
+          <w:p>
+            <w:pPr>
+              <w:pStyle w:val="ListParagraph"/>
+              <w:numPr>
+                <w:ilvl w:val="0"/>
+                <w:numId w:val="32"/>
+              </w:numPr>
+            </w:pPr>
+            <w:r>
+              <w:t xml:space="preserve">Interact with </w:t>
+            </w:r>
+            <w:r>
+              <w:t>discount type field on product specific page</w:t>
+            </w:r>
+            <w:r>
+              <w:t xml:space="preserve"> to change discount type only if the product is of the producer</w:t>
+            </w:r>
+          </w:p>
+          <w:p>
+            <w:pPr>
+              <w:pStyle w:val="ListParagraph"/>
+              <w:numPr>
+                <w:ilvl w:val="0"/>
+                <w:numId w:val="32"/>
+              </w:numPr>
+            </w:pPr>
+            <w:r>
+              <w:t>Interact view “Save Changes” to save the changes made to the discount type field</w:t>
+            </w:r>
+          </w:p>
+        </w:tc>
+        <w:tc>
+          <w:tcPr>
+            <w:tcW w:w="2127" w:type="dxa"/>
+          </w:tcPr>
+          <w:p>
+            <w:r>
+              <w:lastRenderedPageBreak/>
+              <w:t xml:space="preserve">This will allow to create a community of loyal customers as their being rewarded </w:t>
+            </w:r>
+            <w:r>
+              <w:lastRenderedPageBreak/>
+              <w:t>for their contribution to the business. Furthermore, having this rewards system will entice new customers to become frequent customers, so they too can get discounted products. This ultimately will allow the client’s business to grow more quickly.</w:t>
+            </w:r>
+          </w:p>
+        </w:tc>
+      </w:tr>
+      <w:tr>
+        <w:tc>
+          <w:tcPr>
+            <w:tcW w:w="1980" w:type="dxa"/>
+          </w:tcPr>
+          <w:p>
+            <w:r>
+              <w:lastRenderedPageBreak/>
+              <w:t>Users able to change the application according to their accessibility needs</w:t>
+            </w:r>
+          </w:p>
+        </w:tc>
+        <w:tc>
+          <w:tcPr>
+            <w:tcW w:w="2835" w:type="dxa"/>
+          </w:tcPr>
+          <w:p>
+            <w:r>
+              <w:t>As Bob, Greg and Sophie, I want to be able to change the application according to my accessibility needs, so that I can use the application comfortably.</w:t>
+            </w:r>
+          </w:p>
+        </w:tc>
+        <w:tc>
+          <w:tcPr>
+            <w:tcW w:w="2551" w:type="dxa"/>
+          </w:tcPr>
+          <w:p>
+            <w:pPr>
+              <w:pStyle w:val="ListParagraph"/>
+              <w:numPr>
+                <w:ilvl w:val="0"/>
+                <w:numId w:val="17"/>
+              </w:numPr>
+            </w:pPr>
+            <w:r>
+              <w:t>View navigation bar</w:t>
+            </w:r>
+          </w:p>
+          <w:p>
+            <w:pPr>
+              <w:pStyle w:val="ListParagraph"/>
+              <w:numPr>
+                <w:ilvl w:val="0"/>
+                <w:numId w:val="17"/>
+              </w:numPr>
+            </w:pPr>
+            <w:r>
+              <w:t>View theme switch button on navigation bar</w:t>
+            </w:r>
+          </w:p>
+          <w:p>
+            <w:pPr>
+              <w:pStyle w:val="ListParagraph"/>
+              <w:numPr>
+                <w:ilvl w:val="0"/>
+                <w:numId w:val="17"/>
+              </w:numPr>
+            </w:pPr>
+            <w:r>
+              <w:t>View text-to-speech button on navigation bar</w:t>
+            </w:r>
+          </w:p>
+          <w:p>
+            <w:pPr>
+              <w:pStyle w:val="ListParagraph"/>
+              <w:numPr>
+                <w:ilvl w:val="0"/>
+                <w:numId w:val="17"/>
+              </w:numPr>
+            </w:pPr>
+            <w:r>
+              <w:t>View high contrast button on navigation bar</w:t>
+            </w:r>
+          </w:p>
+          <w:p>
+            <w:pPr>
+              <w:pStyle w:val="ListParagraph"/>
+              <w:numPr>
+                <w:ilvl w:val="0"/>
+                <w:numId w:val="17"/>
+              </w:numPr>
+            </w:pPr>
+            <w:r>
+              <w:t>View font size adjustment buttons</w:t>
+            </w:r>
+            <w:r>
+              <w:t xml:space="preserve"> </w:t>
+            </w:r>
+            <w:r>
+              <w:t>on navigation bar</w:t>
+            </w:r>
+          </w:p>
+          <w:p>
+            <w:pPr>
+              <w:pStyle w:val="ListParagraph"/>
+              <w:numPr>
+                <w:ilvl w:val="0"/>
+                <w:numId w:val="17"/>
+              </w:numPr>
+            </w:pPr>
+            <w:r>
+              <w:t xml:space="preserve">Interact with </w:t>
+            </w:r>
+            <w:r>
+              <w:t>theme switch button</w:t>
+            </w:r>
+            <w:r>
+              <w:t xml:space="preserve"> to change between light mode and dark mode</w:t>
+            </w:r>
+          </w:p>
+          <w:p>
+            <w:pPr>
+              <w:pStyle w:val="ListParagraph"/>
+              <w:numPr>
+                <w:ilvl w:val="0"/>
+                <w:numId w:val="17"/>
+              </w:numPr>
+            </w:pPr>
+            <w:r>
+              <w:t xml:space="preserve">Interact with </w:t>
+            </w:r>
+            <w:r>
+              <w:t>text-to-speech button</w:t>
+            </w:r>
+            <w:r>
+              <w:t xml:space="preserve"> to use text-to-speech</w:t>
+            </w:r>
+          </w:p>
+          <w:p>
+            <w:pPr>
+              <w:pStyle w:val="ListParagraph"/>
+              <w:numPr>
+                <w:ilvl w:val="0"/>
+                <w:numId w:val="17"/>
+              </w:numPr>
+            </w:pPr>
+            <w:r>
+              <w:t xml:space="preserve">Interact with </w:t>
+            </w:r>
+            <w:r>
+              <w:t>font size adjustment buttons</w:t>
+            </w:r>
+            <w:r>
+              <w:t xml:space="preserve"> to increase or decrease font size</w:t>
+            </w:r>
+          </w:p>
+        </w:tc>
+        <w:tc>
+          <w:tcPr>
+            <w:tcW w:w="2127" w:type="dxa"/>
+          </w:tcPr>
+          <w:p>
+            <w:r>
+              <w:t>This will allow users to change the application according to their accessibility needs. For example, text-to-speech, high contrast more, or font size adjusting. This benefit the client as they will have different ages and different ability of customers, and by providing this they will be able to serve them and increase the potential customers they can sell products to.</w:t>
+            </w:r>
+          </w:p>
+        </w:tc>
+      </w:tr>
+      <w:tr>
+        <w:tc>
+          <w:tcPr>
+            <w:tcW w:w="1980" w:type="dxa"/>
+          </w:tcPr>
+          <w:p>
+            <w:r>
+              <w:lastRenderedPageBreak/>
+              <w:t>Add access control pages based on user roles</w:t>
+            </w:r>
+          </w:p>
+        </w:tc>
+        <w:tc>
+          <w:tcPr>
+            <w:tcW w:w="2835" w:type="dxa"/>
+          </w:tcPr>
+          <w:p>
+            <w:r>
+              <w:t>As Bob, Greg and Sophie, I want to be able view relevant pages to me, so that I cannot do something that I am not allowed to do.</w:t>
+            </w:r>
+          </w:p>
+        </w:tc>
+        <w:tc>
+          <w:tcPr>
+            <w:tcW w:w="2551" w:type="dxa"/>
+          </w:tcPr>
+          <w:p>
+            <w:pPr>
+              <w:pStyle w:val="ListParagraph"/>
+              <w:numPr>
+                <w:ilvl w:val="0"/>
+                <w:numId w:val="33"/>
+              </w:numPr>
+            </w:pPr>
+            <w:r>
+              <w:t xml:space="preserve">View all </w:t>
+            </w:r>
+            <w:r>
+              <w:t>pages</w:t>
+            </w:r>
+          </w:p>
+          <w:p>
+            <w:pPr>
+              <w:pStyle w:val="ListParagraph"/>
+              <w:numPr>
+                <w:ilvl w:val="0"/>
+                <w:numId w:val="33"/>
+              </w:numPr>
+            </w:pPr>
+            <w:r>
+              <w:t>View access denied page</w:t>
+            </w:r>
+          </w:p>
+          <w:p>
+            <w:pPr>
+              <w:pStyle w:val="ListParagraph"/>
+              <w:numPr>
+                <w:ilvl w:val="0"/>
+                <w:numId w:val="33"/>
+              </w:numPr>
+            </w:pPr>
+            <w:r>
+              <w:t>Access denied page displayed when unauthorised user accesses a page</w:t>
+            </w:r>
+          </w:p>
+          <w:p>
+            <w:pPr>
+              <w:pStyle w:val="ListParagraph"/>
+              <w:numPr>
+                <w:ilvl w:val="0"/>
+                <w:numId w:val="33"/>
+              </w:numPr>
+            </w:pPr>
+            <w:r>
+              <w:t>Pages shown to the authorised user roles</w:t>
+            </w:r>
+          </w:p>
+          <w:p>
+            <w:pPr>
+              <w:pStyle w:val="ListParagraph"/>
+              <w:numPr>
+                <w:ilvl w:val="0"/>
+                <w:numId w:val="33"/>
+              </w:numPr>
+            </w:pPr>
+            <w:r>
+              <w:t>Actions not processed for unauthorised roles on unauthorised pages</w:t>
+            </w:r>
           </w:p>
         </w:tc>
         <w:tc>
@@ -4320,7 +4733,6 @@
           </w:p>
           <w:p>
             <w:r>
-              <w:lastRenderedPageBreak/>
               <w:t xml:space="preserve">Webpages containing less than 20 high quality images should load within </w:t>
             </w:r>
             <w:r>
@@ -4350,7 +4762,6 @@
           </w:tcPr>
           <w:p>
             <w:r>
-              <w:lastRenderedPageBreak/>
               <w:t xml:space="preserve">The system must handle a specific number of </w:t>
             </w:r>
             <w:r>
@@ -4890,7 +5301,6 @@
               <w:t xml:space="preserve"> and </w:t>
             </w:r>
             <w:r>
-              <w:lastRenderedPageBreak/>
               <w:t xml:space="preserve">protect themselves from any fines </w:t>
             </w:r>
             <w:r>
@@ -4904,17 +5314,32 @@
           </w:tcPr>
           <w:p>
             <w:r>
-              <w:lastRenderedPageBreak/>
               <w:t xml:space="preserve">Cookies should be visible on any page </w:t>
             </w:r>
             <w:r>
-              <w:t xml:space="preserve">of the website with a </w:t>
-            </w:r>
-            <w:r>
-              <w:lastRenderedPageBreak/>
-              <w:t>clear way to accept or deny the cookies.</w:t>
-            </w:r>
-          </w:p>
+              <w:t>of the website with a clear way to accept or deny the cookies.</w:t>
+            </w:r>
+          </w:p>
+        </w:tc>
+      </w:tr>
+      <w:tr>
+        <w:tc>
+          <w:tcPr>
+            <w:tcW w:w="3005" w:type="dxa"/>
+          </w:tcPr>
+          <w:p/>
+        </w:tc>
+        <w:tc>
+          <w:tcPr>
+            <w:tcW w:w="3005" w:type="dxa"/>
+          </w:tcPr>
+          <w:p/>
+        </w:tc>
+        <w:tc>
+          <w:tcPr>
+            <w:tcW w:w="3006" w:type="dxa"/>
+          </w:tcPr>
+          <w:p/>
         </w:tc>
       </w:tr>
     </w:tbl>
@@ -5308,7 +5733,11 @@
           </w:tcPr>
           <w:p>
             <w:r>
-              <w:t>This will ensure that website will still be providing a smooth experience even if there is an increase in users.</w:t>
+              <w:t xml:space="preserve">This will ensure that website will still be providing a smooth </w:t>
+            </w:r>
+            <w:r>
+              <w:lastRenderedPageBreak/>
+              <w:t>experience even if there is an increase in users.</w:t>
             </w:r>
           </w:p>
         </w:tc>
@@ -5318,6 +5747,7 @@
           </w:tcPr>
           <w:p>
             <w:r>
+              <w:lastRenderedPageBreak/>
               <w:t>On average traffic should be dispersed evenly across all the different servers.</w:t>
             </w:r>
           </w:p>
@@ -5601,7 +6031,6 @@
           </w:tcPr>
           <w:p>
             <w:r>
-              <w:lastRenderedPageBreak/>
               <w:t>Shou</w:t>
             </w:r>
             <w:r>
@@ -5882,6 +6311,7 @@
         </w:numPr>
       </w:pPr>
       <w:r>
+        <w:lastRenderedPageBreak/>
         <w:t>PBR 4</w:t>
       </w:r>
     </w:p>
@@ -6009,7 +6439,6 @@
         </w:numPr>
       </w:pPr>
       <w:r>
-        <w:lastRenderedPageBreak/>
         <w:t>Red Coloured Cells = High priority risks</w:t>
       </w:r>
     </w:p>
@@ -6814,6 +7243,7 @@
           </w:tcPr>
           <w:p>
             <w:r>
+              <w:lastRenderedPageBreak/>
               <w:t>PBR 2</w:t>
             </w:r>
           </w:p>
@@ -7110,7 +7540,6 @@
           </w:tcPr>
           <w:p>
             <w:r>
-              <w:lastRenderedPageBreak/>
               <w:t>GDPR</w:t>
             </w:r>
             <w:r>
@@ -7313,6 +7742,119 @@
 <file path=word/numbering.xml><?xml version="1.0" encoding="utf-8"?>
 <w:numbering xmlns:wpc="http://schemas.microsoft.com/office/word/2010/wordprocessingCanvas" xmlns:cx="http://schemas.microsoft.com/office/drawing/2014/chartex" xmlns:cx1="http://schemas.microsoft.com/office/drawing/2015/9/8/chartex" xmlns:cx2="http://schemas.microsoft.com/office/drawing/2015/10/21/chartex" xmlns:cx3="http://schemas.microsoft.com/office/drawing/2016/5/9/chartex" xmlns:cx4="http://schemas.microsoft.com/office/drawing/2016/5/10/chartex" xmlns:cx5="http://schemas.microsoft.com/office/drawing/2016/5/11/chartex" xmlns:cx6="http://schemas.microsoft.com/office/drawing/2016/5/12/chartex" xmlns:cx7="http://schemas.microsoft.com/office/drawing/2016/5/13/chartex" xmlns:cx8="http://schemas.microsoft.com/office/drawing/2016/5/14/chartex" xmlns:mc="http://schemas.openxmlformats.org/markup-compatibility/2006" xmlns:aink="http://schemas.microsoft.com/office/drawing/2016/ink" xmlns:am3d="http://schemas.microsoft.com/office/drawing/2017/model3d" xmlns:o="urn:schemas-microsoft-com:office:office" xmlns:oel="http://schemas.microsoft.com/office/2019/extlst" xmlns:r="http://schemas.openxmlformats.org/officeDocument/2006/relationships" xmlns:m="http://schemas.openxmlformats.org/officeDocument/2006/math" xmlns:v="urn:schemas-microsoft-com:vml" xmlns:wp14="http://schemas.microsoft.com/office/word/2010/wordprocessingDrawing" xmlns:wp="http://schemas.openxmlformats.org/drawingml/2006/wordprocessingDrawing" xmlns:w10="urn:schemas-microsoft-com:office:word" xmlns:w="http://schemas.openxmlformats.org/wordprocessingml/2006/main" xmlns:w14="http://schemas.microsoft.com/office/word/2010/wordml" xmlns:w15="http://schemas.microsoft.com/office/word/2012/wordml" xmlns:w16cex="http://schemas.microsoft.com/office/word/2018/wordml/cex" xmlns:w16cid="http://schemas.microsoft.com/office/word/2016/wordml/cid" xmlns:w16="http://schemas.microsoft.com/office/word/2018/wordml" xmlns:w16du="http://schemas.microsoft.com/office/word/2023/wordml/word16du" xmlns:w16sdtdh="http://schemas.microsoft.com/office/word/2020/wordml/sdtdatahash" xmlns:w16sdtfl="http://schemas.microsoft.com/office/word/2024/wordml/sdtformatlock" xmlns:w16se="http://schemas.microsoft.com/office/word/2015/wordml/symex" xmlns:wpg="http://schemas.microsoft.com/office/word/2010/wordprocessingGroup" xmlns:wpi="http://schemas.microsoft.com/office/word/2010/wordprocessingInk" xmlns:wne="http://schemas.microsoft.com/office/word/2006/wordml" xmlns:wps="http://schemas.microsoft.com/office/word/2010/wordprocessingShape" mc:Ignorable="w14 w15 w16se w16cid w16 w16cex w16sdtdh w16sdtfl w16du wp14">
   <w:abstractNum w:abstractNumId="0" w15:restartNumberingAfterBreak="0">
+    <w:nsid w:val="018874AC"/>
+    <w:multiLevelType w:val="hybridMultilevel"/>
+    <w:tmpl w:val="7A78F4A6"/>
+    <w:lvl w:ilvl="0" w:tplc="08090001">
+      <w:start w:val="1"/>
+      <w:numFmt w:val="bullet"/>
+      <w:lvlText w:val=""/>
+      <w:lvlJc w:val="left"/>
+      <w:pPr>
+        <w:ind w:left="360" w:hanging="360"/>
+      </w:pPr>
+      <w:rPr>
+        <w:rFonts w:ascii="Symbol" w:hAnsi="Symbol" w:hint="default"/>
+      </w:rPr>
+    </w:lvl>
+    <w:lvl w:ilvl="1" w:tplc="08090003" w:tentative="1">
+      <w:start w:val="1"/>
+      <w:numFmt w:val="bullet"/>
+      <w:lvlText w:val="o"/>
+      <w:lvlJc w:val="left"/>
+      <w:pPr>
+        <w:ind w:left="1080" w:hanging="360"/>
+      </w:pPr>
+      <w:rPr>
+        <w:rFonts w:ascii="Courier New" w:hAnsi="Courier New" w:cs="Courier New" w:hint="default"/>
+      </w:rPr>
+    </w:lvl>
+    <w:lvl w:ilvl="2" w:tplc="08090005" w:tentative="1">
+      <w:start w:val="1"/>
+      <w:numFmt w:val="bullet"/>
+      <w:lvlText w:val=""/>
+      <w:lvlJc w:val="left"/>
+      <w:pPr>
+        <w:ind w:left="1800" w:hanging="360"/>
+      </w:pPr>
+      <w:rPr>
+        <w:rFonts w:ascii="Wingdings" w:hAnsi="Wingdings" w:hint="default"/>
+      </w:rPr>
+    </w:lvl>
+    <w:lvl w:ilvl="3" w:tplc="08090001" w:tentative="1">
+      <w:start w:val="1"/>
+      <w:numFmt w:val="bullet"/>
+      <w:lvlText w:val=""/>
+      <w:lvlJc w:val="left"/>
+      <w:pPr>
+        <w:ind w:left="2520" w:hanging="360"/>
+      </w:pPr>
+      <w:rPr>
+        <w:rFonts w:ascii="Symbol" w:hAnsi="Symbol" w:hint="default"/>
+      </w:rPr>
+    </w:lvl>
+    <w:lvl w:ilvl="4" w:tplc="08090003" w:tentative="1">
+      <w:start w:val="1"/>
+      <w:numFmt w:val="bullet"/>
+      <w:lvlText w:val="o"/>
+      <w:lvlJc w:val="left"/>
+      <w:pPr>
+        <w:ind w:left="3240" w:hanging="360"/>
+      </w:pPr>
+      <w:rPr>
+        <w:rFonts w:ascii="Courier New" w:hAnsi="Courier New" w:cs="Courier New" w:hint="default"/>
+      </w:rPr>
+    </w:lvl>
+    <w:lvl w:ilvl="5" w:tplc="08090005" w:tentative="1">
+      <w:start w:val="1"/>
+      <w:numFmt w:val="bullet"/>
+      <w:lvlText w:val=""/>
+      <w:lvlJc w:val="left"/>
+      <w:pPr>
+        <w:ind w:left="3960" w:hanging="360"/>
+      </w:pPr>
+      <w:rPr>
+        <w:rFonts w:ascii="Wingdings" w:hAnsi="Wingdings" w:hint="default"/>
+      </w:rPr>
+    </w:lvl>
+    <w:lvl w:ilvl="6" w:tplc="08090001" w:tentative="1">
+      <w:start w:val="1"/>
+      <w:numFmt w:val="bullet"/>
+      <w:lvlText w:val=""/>
+      <w:lvlJc w:val="left"/>
+      <w:pPr>
+        <w:ind w:left="4680" w:hanging="360"/>
+      </w:pPr>
+      <w:rPr>
+        <w:rFonts w:ascii="Symbol" w:hAnsi="Symbol" w:hint="default"/>
+      </w:rPr>
+    </w:lvl>
+    <w:lvl w:ilvl="7" w:tplc="08090003" w:tentative="1">
+      <w:start w:val="1"/>
+      <w:numFmt w:val="bullet"/>
+      <w:lvlText w:val="o"/>
+      <w:lvlJc w:val="left"/>
+      <w:pPr>
+        <w:ind w:left="5400" w:hanging="360"/>
+      </w:pPr>
+      <w:rPr>
+        <w:rFonts w:ascii="Courier New" w:hAnsi="Courier New" w:cs="Courier New" w:hint="default"/>
+      </w:rPr>
+    </w:lvl>
+    <w:lvl w:ilvl="8" w:tplc="08090005" w:tentative="1">
+      <w:start w:val="1"/>
+      <w:numFmt w:val="bullet"/>
+      <w:lvlText w:val=""/>
+      <w:lvlJc w:val="left"/>
+      <w:pPr>
+        <w:ind w:left="6120" w:hanging="360"/>
+      </w:pPr>
+      <w:rPr>
+        <w:rFonts w:ascii="Wingdings" w:hAnsi="Wingdings" w:hint="default"/>
+      </w:rPr>
+    </w:lvl>
+  </w:abstractNum>
+  <w:abstractNum w:abstractNumId="1" w15:restartNumberingAfterBreak="0">
     <w:nsid w:val="024E1374"/>
     <w:multiLevelType w:val="hybridMultilevel"/>
     <w:tmpl w:val="1ED0633C"/>
@@ -7425,7 +7967,7 @@
       </w:rPr>
     </w:lvl>
   </w:abstractNum>
-  <w:abstractNum w:abstractNumId="1" w15:restartNumberingAfterBreak="0">
+  <w:abstractNum w:abstractNumId="2" w15:restartNumberingAfterBreak="0">
     <w:nsid w:val="069D5F21"/>
     <w:multiLevelType w:val="hybridMultilevel"/>
     <w:tmpl w:val="8D68756A"/>
@@ -7538,7 +8080,7 @@
       </w:rPr>
     </w:lvl>
   </w:abstractNum>
-  <w:abstractNum w:abstractNumId="2" w15:restartNumberingAfterBreak="0">
+  <w:abstractNum w:abstractNumId="3" w15:restartNumberingAfterBreak="0">
     <w:nsid w:val="07127A74"/>
     <w:multiLevelType w:val="hybridMultilevel"/>
     <w:tmpl w:val="45FC2ABC"/>
@@ -7649,7 +8191,7 @@
       </w:rPr>
     </w:lvl>
   </w:abstractNum>
-  <w:abstractNum w:abstractNumId="3" w15:restartNumberingAfterBreak="0">
+  <w:abstractNum w:abstractNumId="4" w15:restartNumberingAfterBreak="0">
     <w:nsid w:val="0A1875C4"/>
     <w:multiLevelType w:val="hybridMultilevel"/>
     <w:tmpl w:val="7408E9BA"/>
@@ -7761,7 +8303,7 @@
       </w:rPr>
     </w:lvl>
   </w:abstractNum>
-  <w:abstractNum w:abstractNumId="4" w15:restartNumberingAfterBreak="0">
+  <w:abstractNum w:abstractNumId="5" w15:restartNumberingAfterBreak="0">
     <w:nsid w:val="0E4B1545"/>
     <w:multiLevelType w:val="hybridMultilevel"/>
     <w:tmpl w:val="1ACEA44C"/>
@@ -7873,7 +8415,7 @@
       </w:rPr>
     </w:lvl>
   </w:abstractNum>
-  <w:abstractNum w:abstractNumId="5" w15:restartNumberingAfterBreak="0">
+  <w:abstractNum w:abstractNumId="6" w15:restartNumberingAfterBreak="0">
     <w:nsid w:val="10357F79"/>
     <w:multiLevelType w:val="hybridMultilevel"/>
     <w:tmpl w:val="496AFE5A"/>
@@ -7985,7 +8527,7 @@
       </w:rPr>
     </w:lvl>
   </w:abstractNum>
-  <w:abstractNum w:abstractNumId="6" w15:restartNumberingAfterBreak="0">
+  <w:abstractNum w:abstractNumId="7" w15:restartNumberingAfterBreak="0">
     <w:nsid w:val="12562EC8"/>
     <w:multiLevelType w:val="hybridMultilevel"/>
     <w:tmpl w:val="8208FCCE"/>
@@ -8097,7 +8639,7 @@
       </w:rPr>
     </w:lvl>
   </w:abstractNum>
-  <w:abstractNum w:abstractNumId="7" w15:restartNumberingAfterBreak="0">
+  <w:abstractNum w:abstractNumId="8" w15:restartNumberingAfterBreak="0">
     <w:nsid w:val="155B6E8B"/>
     <w:multiLevelType w:val="hybridMultilevel"/>
     <w:tmpl w:val="16BEC092"/>
@@ -8210,7 +8752,7 @@
       </w:rPr>
     </w:lvl>
   </w:abstractNum>
-  <w:abstractNum w:abstractNumId="8" w15:restartNumberingAfterBreak="0">
+  <w:abstractNum w:abstractNumId="9" w15:restartNumberingAfterBreak="0">
     <w:nsid w:val="1A241540"/>
     <w:multiLevelType w:val="hybridMultilevel"/>
     <w:tmpl w:val="DD80F6C8"/>
@@ -8323,7 +8865,7 @@
       </w:rPr>
     </w:lvl>
   </w:abstractNum>
-  <w:abstractNum w:abstractNumId="9" w15:restartNumberingAfterBreak="0">
+  <w:abstractNum w:abstractNumId="10" w15:restartNumberingAfterBreak="0">
     <w:nsid w:val="1DA85D3F"/>
     <w:multiLevelType w:val="hybridMultilevel"/>
     <w:tmpl w:val="FABCAAE0"/>
@@ -8436,7 +8978,7 @@
       </w:rPr>
     </w:lvl>
   </w:abstractNum>
-  <w:abstractNum w:abstractNumId="10" w15:restartNumberingAfterBreak="0">
+  <w:abstractNum w:abstractNumId="11" w15:restartNumberingAfterBreak="0">
     <w:nsid w:val="24B43EE5"/>
     <w:multiLevelType w:val="hybridMultilevel"/>
     <w:tmpl w:val="0018E8D0"/>
@@ -8525,7 +9067,7 @@
       </w:pPr>
     </w:lvl>
   </w:abstractNum>
-  <w:abstractNum w:abstractNumId="11" w15:restartNumberingAfterBreak="0">
+  <w:abstractNum w:abstractNumId="12" w15:restartNumberingAfterBreak="0">
     <w:nsid w:val="25143555"/>
     <w:multiLevelType w:val="hybridMultilevel"/>
     <w:tmpl w:val="9E2C63B2"/>
@@ -8611,7 +9153,7 @@
       </w:pPr>
     </w:lvl>
   </w:abstractNum>
-  <w:abstractNum w:abstractNumId="12" w15:restartNumberingAfterBreak="0">
+  <w:abstractNum w:abstractNumId="13" w15:restartNumberingAfterBreak="0">
     <w:nsid w:val="285E6777"/>
     <w:multiLevelType w:val="hybridMultilevel"/>
     <w:tmpl w:val="34B436EA"/>
@@ -8697,7 +9239,7 @@
       </w:pPr>
     </w:lvl>
   </w:abstractNum>
-  <w:abstractNum w:abstractNumId="13" w15:restartNumberingAfterBreak="0">
+  <w:abstractNum w:abstractNumId="14" w15:restartNumberingAfterBreak="0">
     <w:nsid w:val="2B2C7C13"/>
     <w:multiLevelType w:val="hybridMultilevel"/>
     <w:tmpl w:val="02968A02"/>
@@ -8809,7 +9351,233 @@
       </w:rPr>
     </w:lvl>
   </w:abstractNum>
-  <w:abstractNum w:abstractNumId="14" w15:restartNumberingAfterBreak="0">
+  <w:abstractNum w:abstractNumId="15" w15:restartNumberingAfterBreak="0">
+    <w:nsid w:val="342A6224"/>
+    <w:multiLevelType w:val="hybridMultilevel"/>
+    <w:tmpl w:val="B69638BC"/>
+    <w:lvl w:ilvl="0" w:tplc="08090001">
+      <w:start w:val="1"/>
+      <w:numFmt w:val="bullet"/>
+      <w:lvlText w:val=""/>
+      <w:lvlJc w:val="left"/>
+      <w:pPr>
+        <w:ind w:left="360" w:hanging="360"/>
+      </w:pPr>
+      <w:rPr>
+        <w:rFonts w:ascii="Symbol" w:hAnsi="Symbol" w:hint="default"/>
+      </w:rPr>
+    </w:lvl>
+    <w:lvl w:ilvl="1" w:tplc="08090003" w:tentative="1">
+      <w:start w:val="1"/>
+      <w:numFmt w:val="bullet"/>
+      <w:lvlText w:val="o"/>
+      <w:lvlJc w:val="left"/>
+      <w:pPr>
+        <w:ind w:left="1080" w:hanging="360"/>
+      </w:pPr>
+      <w:rPr>
+        <w:rFonts w:ascii="Courier New" w:hAnsi="Courier New" w:cs="Courier New" w:hint="default"/>
+      </w:rPr>
+    </w:lvl>
+    <w:lvl w:ilvl="2" w:tplc="08090005" w:tentative="1">
+      <w:start w:val="1"/>
+      <w:numFmt w:val="bullet"/>
+      <w:lvlText w:val=""/>
+      <w:lvlJc w:val="left"/>
+      <w:pPr>
+        <w:ind w:left="1800" w:hanging="360"/>
+      </w:pPr>
+      <w:rPr>
+        <w:rFonts w:ascii="Wingdings" w:hAnsi="Wingdings" w:hint="default"/>
+      </w:rPr>
+    </w:lvl>
+    <w:lvl w:ilvl="3" w:tplc="08090001" w:tentative="1">
+      <w:start w:val="1"/>
+      <w:numFmt w:val="bullet"/>
+      <w:lvlText w:val=""/>
+      <w:lvlJc w:val="left"/>
+      <w:pPr>
+        <w:ind w:left="2520" w:hanging="360"/>
+      </w:pPr>
+      <w:rPr>
+        <w:rFonts w:ascii="Symbol" w:hAnsi="Symbol" w:hint="default"/>
+      </w:rPr>
+    </w:lvl>
+    <w:lvl w:ilvl="4" w:tplc="08090003" w:tentative="1">
+      <w:start w:val="1"/>
+      <w:numFmt w:val="bullet"/>
+      <w:lvlText w:val="o"/>
+      <w:lvlJc w:val="left"/>
+      <w:pPr>
+        <w:ind w:left="3240" w:hanging="360"/>
+      </w:pPr>
+      <w:rPr>
+        <w:rFonts w:ascii="Courier New" w:hAnsi="Courier New" w:cs="Courier New" w:hint="default"/>
+      </w:rPr>
+    </w:lvl>
+    <w:lvl w:ilvl="5" w:tplc="08090005" w:tentative="1">
+      <w:start w:val="1"/>
+      <w:numFmt w:val="bullet"/>
+      <w:lvlText w:val=""/>
+      <w:lvlJc w:val="left"/>
+      <w:pPr>
+        <w:ind w:left="3960" w:hanging="360"/>
+      </w:pPr>
+      <w:rPr>
+        <w:rFonts w:ascii="Wingdings" w:hAnsi="Wingdings" w:hint="default"/>
+      </w:rPr>
+    </w:lvl>
+    <w:lvl w:ilvl="6" w:tplc="08090001" w:tentative="1">
+      <w:start w:val="1"/>
+      <w:numFmt w:val="bullet"/>
+      <w:lvlText w:val=""/>
+      <w:lvlJc w:val="left"/>
+      <w:pPr>
+        <w:ind w:left="4680" w:hanging="360"/>
+      </w:pPr>
+      <w:rPr>
+        <w:rFonts w:ascii="Symbol" w:hAnsi="Symbol" w:hint="default"/>
+      </w:rPr>
+    </w:lvl>
+    <w:lvl w:ilvl="7" w:tplc="08090003" w:tentative="1">
+      <w:start w:val="1"/>
+      <w:numFmt w:val="bullet"/>
+      <w:lvlText w:val="o"/>
+      <w:lvlJc w:val="left"/>
+      <w:pPr>
+        <w:ind w:left="5400" w:hanging="360"/>
+      </w:pPr>
+      <w:rPr>
+        <w:rFonts w:ascii="Courier New" w:hAnsi="Courier New" w:cs="Courier New" w:hint="default"/>
+      </w:rPr>
+    </w:lvl>
+    <w:lvl w:ilvl="8" w:tplc="08090005" w:tentative="1">
+      <w:start w:val="1"/>
+      <w:numFmt w:val="bullet"/>
+      <w:lvlText w:val=""/>
+      <w:lvlJc w:val="left"/>
+      <w:pPr>
+        <w:ind w:left="6120" w:hanging="360"/>
+      </w:pPr>
+      <w:rPr>
+        <w:rFonts w:ascii="Wingdings" w:hAnsi="Wingdings" w:hint="default"/>
+      </w:rPr>
+    </w:lvl>
+  </w:abstractNum>
+  <w:abstractNum w:abstractNumId="16" w15:restartNumberingAfterBreak="0">
+    <w:nsid w:val="3751532F"/>
+    <w:multiLevelType w:val="hybridMultilevel"/>
+    <w:tmpl w:val="D8B64EF0"/>
+    <w:lvl w:ilvl="0" w:tplc="08090001">
+      <w:start w:val="1"/>
+      <w:numFmt w:val="bullet"/>
+      <w:lvlText w:val=""/>
+      <w:lvlJc w:val="left"/>
+      <w:pPr>
+        <w:ind w:left="360" w:hanging="360"/>
+      </w:pPr>
+      <w:rPr>
+        <w:rFonts w:ascii="Symbol" w:hAnsi="Symbol" w:hint="default"/>
+      </w:rPr>
+    </w:lvl>
+    <w:lvl w:ilvl="1" w:tplc="08090003" w:tentative="1">
+      <w:start w:val="1"/>
+      <w:numFmt w:val="bullet"/>
+      <w:lvlText w:val="o"/>
+      <w:lvlJc w:val="left"/>
+      <w:pPr>
+        <w:ind w:left="1080" w:hanging="360"/>
+      </w:pPr>
+      <w:rPr>
+        <w:rFonts w:ascii="Courier New" w:hAnsi="Courier New" w:cs="Courier New" w:hint="default"/>
+      </w:rPr>
+    </w:lvl>
+    <w:lvl w:ilvl="2" w:tplc="08090005" w:tentative="1">
+      <w:start w:val="1"/>
+      <w:numFmt w:val="bullet"/>
+      <w:lvlText w:val=""/>
+      <w:lvlJc w:val="left"/>
+      <w:pPr>
+        <w:ind w:left="1800" w:hanging="360"/>
+      </w:pPr>
+      <w:rPr>
+        <w:rFonts w:ascii="Wingdings" w:hAnsi="Wingdings" w:hint="default"/>
+      </w:rPr>
+    </w:lvl>
+    <w:lvl w:ilvl="3" w:tplc="08090001" w:tentative="1">
+      <w:start w:val="1"/>
+      <w:numFmt w:val="bullet"/>
+      <w:lvlText w:val=""/>
+      <w:lvlJc w:val="left"/>
+      <w:pPr>
+        <w:ind w:left="2520" w:hanging="360"/>
+      </w:pPr>
+      <w:rPr>
+        <w:rFonts w:ascii="Symbol" w:hAnsi="Symbol" w:hint="default"/>
+      </w:rPr>
+    </w:lvl>
+    <w:lvl w:ilvl="4" w:tplc="08090003" w:tentative="1">
+      <w:start w:val="1"/>
+      <w:numFmt w:val="bullet"/>
+      <w:lvlText w:val="o"/>
+      <w:lvlJc w:val="left"/>
+      <w:pPr>
+        <w:ind w:left="3240" w:hanging="360"/>
+      </w:pPr>
+      <w:rPr>
+        <w:rFonts w:ascii="Courier New" w:hAnsi="Courier New" w:cs="Courier New" w:hint="default"/>
+      </w:rPr>
+    </w:lvl>
+    <w:lvl w:ilvl="5" w:tplc="08090005" w:tentative="1">
+      <w:start w:val="1"/>
+      <w:numFmt w:val="bullet"/>
+      <w:lvlText w:val=""/>
+      <w:lvlJc w:val="left"/>
+      <w:pPr>
+        <w:ind w:left="3960" w:hanging="360"/>
+      </w:pPr>
+      <w:rPr>
+        <w:rFonts w:ascii="Wingdings" w:hAnsi="Wingdings" w:hint="default"/>
+      </w:rPr>
+    </w:lvl>
+    <w:lvl w:ilvl="6" w:tplc="08090001" w:tentative="1">
+      <w:start w:val="1"/>
+      <w:numFmt w:val="bullet"/>
+      <w:lvlText w:val=""/>
+      <w:lvlJc w:val="left"/>
+      <w:pPr>
+        <w:ind w:left="4680" w:hanging="360"/>
+      </w:pPr>
+      <w:rPr>
+        <w:rFonts w:ascii="Symbol" w:hAnsi="Symbol" w:hint="default"/>
+      </w:rPr>
+    </w:lvl>
+    <w:lvl w:ilvl="7" w:tplc="08090003" w:tentative="1">
+      <w:start w:val="1"/>
+      <w:numFmt w:val="bullet"/>
+      <w:lvlText w:val="o"/>
+      <w:lvlJc w:val="left"/>
+      <w:pPr>
+        <w:ind w:left="5400" w:hanging="360"/>
+      </w:pPr>
+      <w:rPr>
+        <w:rFonts w:ascii="Courier New" w:hAnsi="Courier New" w:cs="Courier New" w:hint="default"/>
+      </w:rPr>
+    </w:lvl>
+    <w:lvl w:ilvl="8" w:tplc="08090005" w:tentative="1">
+      <w:start w:val="1"/>
+      <w:numFmt w:val="bullet"/>
+      <w:lvlText w:val=""/>
+      <w:lvlJc w:val="left"/>
+      <w:pPr>
+        <w:ind w:left="6120" w:hanging="360"/>
+      </w:pPr>
+      <w:rPr>
+        <w:rFonts w:ascii="Wingdings" w:hAnsi="Wingdings" w:hint="default"/>
+      </w:rPr>
+    </w:lvl>
+  </w:abstractNum>
+  <w:abstractNum w:abstractNumId="17" w15:restartNumberingAfterBreak="0">
     <w:nsid w:val="3A934B39"/>
     <w:multiLevelType w:val="hybridMultilevel"/>
     <w:tmpl w:val="15B07FBC"/>
@@ -8895,7 +9663,7 @@
       </w:pPr>
     </w:lvl>
   </w:abstractNum>
-  <w:abstractNum w:abstractNumId="15" w15:restartNumberingAfterBreak="0">
+  <w:abstractNum w:abstractNumId="18" w15:restartNumberingAfterBreak="0">
     <w:nsid w:val="42447CAB"/>
     <w:multiLevelType w:val="hybridMultilevel"/>
     <w:tmpl w:val="1D2685E2"/>
@@ -8984,7 +9752,7 @@
       </w:pPr>
     </w:lvl>
   </w:abstractNum>
-  <w:abstractNum w:abstractNumId="16" w15:restartNumberingAfterBreak="0">
+  <w:abstractNum w:abstractNumId="19" w15:restartNumberingAfterBreak="0">
     <w:nsid w:val="42E34D9B"/>
     <w:multiLevelType w:val="hybridMultilevel"/>
     <w:tmpl w:val="F4BC7552"/>
@@ -9073,7 +9841,7 @@
       </w:pPr>
     </w:lvl>
   </w:abstractNum>
-  <w:abstractNum w:abstractNumId="17" w15:restartNumberingAfterBreak="0">
+  <w:abstractNum w:abstractNumId="20" w15:restartNumberingAfterBreak="0">
     <w:nsid w:val="44E2447E"/>
     <w:multiLevelType w:val="hybridMultilevel"/>
     <w:tmpl w:val="B290E53A"/>
@@ -9186,7 +9954,7 @@
       </w:rPr>
     </w:lvl>
   </w:abstractNum>
-  <w:abstractNum w:abstractNumId="18" w15:restartNumberingAfterBreak="0">
+  <w:abstractNum w:abstractNumId="21" w15:restartNumberingAfterBreak="0">
     <w:nsid w:val="47D279C7"/>
     <w:multiLevelType w:val="hybridMultilevel"/>
     <w:tmpl w:val="F684E67E"/>
@@ -9275,7 +10043,233 @@
       </w:pPr>
     </w:lvl>
   </w:abstractNum>
-  <w:abstractNum w:abstractNumId="19" w15:restartNumberingAfterBreak="0">
+  <w:abstractNum w:abstractNumId="22" w15:restartNumberingAfterBreak="0">
+    <w:nsid w:val="58EB02EA"/>
+    <w:multiLevelType w:val="hybridMultilevel"/>
+    <w:tmpl w:val="DE54E472"/>
+    <w:lvl w:ilvl="0" w:tplc="08090001">
+      <w:start w:val="1"/>
+      <w:numFmt w:val="bullet"/>
+      <w:lvlText w:val=""/>
+      <w:lvlJc w:val="left"/>
+      <w:pPr>
+        <w:ind w:left="360" w:hanging="360"/>
+      </w:pPr>
+      <w:rPr>
+        <w:rFonts w:ascii="Symbol" w:hAnsi="Symbol" w:hint="default"/>
+      </w:rPr>
+    </w:lvl>
+    <w:lvl w:ilvl="1" w:tplc="08090003" w:tentative="1">
+      <w:start w:val="1"/>
+      <w:numFmt w:val="bullet"/>
+      <w:lvlText w:val="o"/>
+      <w:lvlJc w:val="left"/>
+      <w:pPr>
+        <w:ind w:left="1080" w:hanging="360"/>
+      </w:pPr>
+      <w:rPr>
+        <w:rFonts w:ascii="Courier New" w:hAnsi="Courier New" w:cs="Courier New" w:hint="default"/>
+      </w:rPr>
+    </w:lvl>
+    <w:lvl w:ilvl="2" w:tplc="08090005" w:tentative="1">
+      <w:start w:val="1"/>
+      <w:numFmt w:val="bullet"/>
+      <w:lvlText w:val=""/>
+      <w:lvlJc w:val="left"/>
+      <w:pPr>
+        <w:ind w:left="1800" w:hanging="360"/>
+      </w:pPr>
+      <w:rPr>
+        <w:rFonts w:ascii="Wingdings" w:hAnsi="Wingdings" w:hint="default"/>
+      </w:rPr>
+    </w:lvl>
+    <w:lvl w:ilvl="3" w:tplc="08090001" w:tentative="1">
+      <w:start w:val="1"/>
+      <w:numFmt w:val="bullet"/>
+      <w:lvlText w:val=""/>
+      <w:lvlJc w:val="left"/>
+      <w:pPr>
+        <w:ind w:left="2520" w:hanging="360"/>
+      </w:pPr>
+      <w:rPr>
+        <w:rFonts w:ascii="Symbol" w:hAnsi="Symbol" w:hint="default"/>
+      </w:rPr>
+    </w:lvl>
+    <w:lvl w:ilvl="4" w:tplc="08090003" w:tentative="1">
+      <w:start w:val="1"/>
+      <w:numFmt w:val="bullet"/>
+      <w:lvlText w:val="o"/>
+      <w:lvlJc w:val="left"/>
+      <w:pPr>
+        <w:ind w:left="3240" w:hanging="360"/>
+      </w:pPr>
+      <w:rPr>
+        <w:rFonts w:ascii="Courier New" w:hAnsi="Courier New" w:cs="Courier New" w:hint="default"/>
+      </w:rPr>
+    </w:lvl>
+    <w:lvl w:ilvl="5" w:tplc="08090005" w:tentative="1">
+      <w:start w:val="1"/>
+      <w:numFmt w:val="bullet"/>
+      <w:lvlText w:val=""/>
+      <w:lvlJc w:val="left"/>
+      <w:pPr>
+        <w:ind w:left="3960" w:hanging="360"/>
+      </w:pPr>
+      <w:rPr>
+        <w:rFonts w:ascii="Wingdings" w:hAnsi="Wingdings" w:hint="default"/>
+      </w:rPr>
+    </w:lvl>
+    <w:lvl w:ilvl="6" w:tplc="08090001" w:tentative="1">
+      <w:start w:val="1"/>
+      <w:numFmt w:val="bullet"/>
+      <w:lvlText w:val=""/>
+      <w:lvlJc w:val="left"/>
+      <w:pPr>
+        <w:ind w:left="4680" w:hanging="360"/>
+      </w:pPr>
+      <w:rPr>
+        <w:rFonts w:ascii="Symbol" w:hAnsi="Symbol" w:hint="default"/>
+      </w:rPr>
+    </w:lvl>
+    <w:lvl w:ilvl="7" w:tplc="08090003" w:tentative="1">
+      <w:start w:val="1"/>
+      <w:numFmt w:val="bullet"/>
+      <w:lvlText w:val="o"/>
+      <w:lvlJc w:val="left"/>
+      <w:pPr>
+        <w:ind w:left="5400" w:hanging="360"/>
+      </w:pPr>
+      <w:rPr>
+        <w:rFonts w:ascii="Courier New" w:hAnsi="Courier New" w:cs="Courier New" w:hint="default"/>
+      </w:rPr>
+    </w:lvl>
+    <w:lvl w:ilvl="8" w:tplc="08090005" w:tentative="1">
+      <w:start w:val="1"/>
+      <w:numFmt w:val="bullet"/>
+      <w:lvlText w:val=""/>
+      <w:lvlJc w:val="left"/>
+      <w:pPr>
+        <w:ind w:left="6120" w:hanging="360"/>
+      </w:pPr>
+      <w:rPr>
+        <w:rFonts w:ascii="Wingdings" w:hAnsi="Wingdings" w:hint="default"/>
+      </w:rPr>
+    </w:lvl>
+  </w:abstractNum>
+  <w:abstractNum w:abstractNumId="23" w15:restartNumberingAfterBreak="0">
+    <w:nsid w:val="5BFB78F5"/>
+    <w:multiLevelType w:val="hybridMultilevel"/>
+    <w:tmpl w:val="40E281F6"/>
+    <w:lvl w:ilvl="0" w:tplc="08090001">
+      <w:start w:val="1"/>
+      <w:numFmt w:val="bullet"/>
+      <w:lvlText w:val=""/>
+      <w:lvlJc w:val="left"/>
+      <w:pPr>
+        <w:ind w:left="720" w:hanging="360"/>
+      </w:pPr>
+      <w:rPr>
+        <w:rFonts w:ascii="Symbol" w:hAnsi="Symbol" w:hint="default"/>
+      </w:rPr>
+    </w:lvl>
+    <w:lvl w:ilvl="1" w:tplc="08090003" w:tentative="1">
+      <w:start w:val="1"/>
+      <w:numFmt w:val="bullet"/>
+      <w:lvlText w:val="o"/>
+      <w:lvlJc w:val="left"/>
+      <w:pPr>
+        <w:ind w:left="1440" w:hanging="360"/>
+      </w:pPr>
+      <w:rPr>
+        <w:rFonts w:ascii="Courier New" w:hAnsi="Courier New" w:cs="Courier New" w:hint="default"/>
+      </w:rPr>
+    </w:lvl>
+    <w:lvl w:ilvl="2" w:tplc="08090005" w:tentative="1">
+      <w:start w:val="1"/>
+      <w:numFmt w:val="bullet"/>
+      <w:lvlText w:val=""/>
+      <w:lvlJc w:val="left"/>
+      <w:pPr>
+        <w:ind w:left="2160" w:hanging="360"/>
+      </w:pPr>
+      <w:rPr>
+        <w:rFonts w:ascii="Wingdings" w:hAnsi="Wingdings" w:hint="default"/>
+      </w:rPr>
+    </w:lvl>
+    <w:lvl w:ilvl="3" w:tplc="08090001" w:tentative="1">
+      <w:start w:val="1"/>
+      <w:numFmt w:val="bullet"/>
+      <w:lvlText w:val=""/>
+      <w:lvlJc w:val="left"/>
+      <w:pPr>
+        <w:ind w:left="2880" w:hanging="360"/>
+      </w:pPr>
+      <w:rPr>
+        <w:rFonts w:ascii="Symbol" w:hAnsi="Symbol" w:hint="default"/>
+      </w:rPr>
+    </w:lvl>
+    <w:lvl w:ilvl="4" w:tplc="08090003" w:tentative="1">
+      <w:start w:val="1"/>
+      <w:numFmt w:val="bullet"/>
+      <w:lvlText w:val="o"/>
+      <w:lvlJc w:val="left"/>
+      <w:pPr>
+        <w:ind w:left="3600" w:hanging="360"/>
+      </w:pPr>
+      <w:rPr>
+        <w:rFonts w:ascii="Courier New" w:hAnsi="Courier New" w:cs="Courier New" w:hint="default"/>
+      </w:rPr>
+    </w:lvl>
+    <w:lvl w:ilvl="5" w:tplc="08090005" w:tentative="1">
+      <w:start w:val="1"/>
+      <w:numFmt w:val="bullet"/>
+      <w:lvlText w:val=""/>
+      <w:lvlJc w:val="left"/>
+      <w:pPr>
+        <w:ind w:left="4320" w:hanging="360"/>
+      </w:pPr>
+      <w:rPr>
+        <w:rFonts w:ascii="Wingdings" w:hAnsi="Wingdings" w:hint="default"/>
+      </w:rPr>
+    </w:lvl>
+    <w:lvl w:ilvl="6" w:tplc="08090001" w:tentative="1">
+      <w:start w:val="1"/>
+      <w:numFmt w:val="bullet"/>
+      <w:lvlText w:val=""/>
+      <w:lvlJc w:val="left"/>
+      <w:pPr>
+        <w:ind w:left="5040" w:hanging="360"/>
+      </w:pPr>
+      <w:rPr>
+        <w:rFonts w:ascii="Symbol" w:hAnsi="Symbol" w:hint="default"/>
+      </w:rPr>
+    </w:lvl>
+    <w:lvl w:ilvl="7" w:tplc="08090003" w:tentative="1">
+      <w:start w:val="1"/>
+      <w:numFmt w:val="bullet"/>
+      <w:lvlText w:val="o"/>
+      <w:lvlJc w:val="left"/>
+      <w:pPr>
+        <w:ind w:left="5760" w:hanging="360"/>
+      </w:pPr>
+      <w:rPr>
+        <w:rFonts w:ascii="Courier New" w:hAnsi="Courier New" w:cs="Courier New" w:hint="default"/>
+      </w:rPr>
+    </w:lvl>
+    <w:lvl w:ilvl="8" w:tplc="08090005" w:tentative="1">
+      <w:start w:val="1"/>
+      <w:numFmt w:val="bullet"/>
+      <w:lvlText w:val=""/>
+      <w:lvlJc w:val="left"/>
+      <w:pPr>
+        <w:ind w:left="6480" w:hanging="360"/>
+      </w:pPr>
+      <w:rPr>
+        <w:rFonts w:ascii="Wingdings" w:hAnsi="Wingdings" w:hint="default"/>
+      </w:rPr>
+    </w:lvl>
+  </w:abstractNum>
+  <w:abstractNum w:abstractNumId="24" w15:restartNumberingAfterBreak="0">
     <w:nsid w:val="5C92227C"/>
     <w:multiLevelType w:val="hybridMultilevel"/>
     <w:tmpl w:val="557E57FE"/>
@@ -9387,7 +10381,7 @@
       </w:rPr>
     </w:lvl>
   </w:abstractNum>
-  <w:abstractNum w:abstractNumId="20" w15:restartNumberingAfterBreak="0">
+  <w:abstractNum w:abstractNumId="25" w15:restartNumberingAfterBreak="0">
     <w:nsid w:val="649D2C19"/>
     <w:multiLevelType w:val="hybridMultilevel"/>
     <w:tmpl w:val="F2E01624"/>
@@ -9500,7 +10494,7 @@
       </w:rPr>
     </w:lvl>
   </w:abstractNum>
-  <w:abstractNum w:abstractNumId="21" w15:restartNumberingAfterBreak="0">
+  <w:abstractNum w:abstractNumId="26" w15:restartNumberingAfterBreak="0">
     <w:nsid w:val="6854278D"/>
     <w:multiLevelType w:val="hybridMultilevel"/>
     <w:tmpl w:val="AA62088E"/>
@@ -9589,7 +10583,7 @@
       </w:pPr>
     </w:lvl>
   </w:abstractNum>
-  <w:abstractNum w:abstractNumId="22" w15:restartNumberingAfterBreak="0">
+  <w:abstractNum w:abstractNumId="27" w15:restartNumberingAfterBreak="0">
     <w:nsid w:val="6AD41083"/>
     <w:multiLevelType w:val="hybridMultilevel"/>
     <w:tmpl w:val="4F68D04A"/>
@@ -9675,7 +10669,7 @@
       </w:pPr>
     </w:lvl>
   </w:abstractNum>
-  <w:abstractNum w:abstractNumId="23" w15:restartNumberingAfterBreak="0">
+  <w:abstractNum w:abstractNumId="28" w15:restartNumberingAfterBreak="0">
     <w:nsid w:val="6F9B684D"/>
     <w:multiLevelType w:val="hybridMultilevel"/>
     <w:tmpl w:val="2A962156"/>
@@ -9788,7 +10782,7 @@
       </w:rPr>
     </w:lvl>
   </w:abstractNum>
-  <w:abstractNum w:abstractNumId="24" w15:restartNumberingAfterBreak="0">
+  <w:abstractNum w:abstractNumId="29" w15:restartNumberingAfterBreak="0">
     <w:nsid w:val="77485005"/>
     <w:multiLevelType w:val="hybridMultilevel"/>
     <w:tmpl w:val="1D54A7B0"/>
@@ -9901,7 +10895,7 @@
       </w:rPr>
     </w:lvl>
   </w:abstractNum>
-  <w:abstractNum w:abstractNumId="25" w15:restartNumberingAfterBreak="0">
+  <w:abstractNum w:abstractNumId="30" w15:restartNumberingAfterBreak="0">
     <w:nsid w:val="77A26102"/>
     <w:multiLevelType w:val="hybridMultilevel"/>
     <w:tmpl w:val="A02892DE"/>
@@ -9987,7 +10981,120 @@
       </w:pPr>
     </w:lvl>
   </w:abstractNum>
-  <w:abstractNum w:abstractNumId="26" w15:restartNumberingAfterBreak="0">
+  <w:abstractNum w:abstractNumId="31" w15:restartNumberingAfterBreak="0">
+    <w:nsid w:val="79254375"/>
+    <w:multiLevelType w:val="hybridMultilevel"/>
+    <w:tmpl w:val="57E8B0D4"/>
+    <w:lvl w:ilvl="0" w:tplc="08090001">
+      <w:start w:val="1"/>
+      <w:numFmt w:val="bullet"/>
+      <w:lvlText w:val=""/>
+      <w:lvlJc w:val="left"/>
+      <w:pPr>
+        <w:ind w:left="360" w:hanging="360"/>
+      </w:pPr>
+      <w:rPr>
+        <w:rFonts w:ascii="Symbol" w:hAnsi="Symbol" w:hint="default"/>
+      </w:rPr>
+    </w:lvl>
+    <w:lvl w:ilvl="1" w:tplc="08090003" w:tentative="1">
+      <w:start w:val="1"/>
+      <w:numFmt w:val="bullet"/>
+      <w:lvlText w:val="o"/>
+      <w:lvlJc w:val="left"/>
+      <w:pPr>
+        <w:ind w:left="1080" w:hanging="360"/>
+      </w:pPr>
+      <w:rPr>
+        <w:rFonts w:ascii="Courier New" w:hAnsi="Courier New" w:cs="Courier New" w:hint="default"/>
+      </w:rPr>
+    </w:lvl>
+    <w:lvl w:ilvl="2" w:tplc="08090005" w:tentative="1">
+      <w:start w:val="1"/>
+      <w:numFmt w:val="bullet"/>
+      <w:lvlText w:val=""/>
+      <w:lvlJc w:val="left"/>
+      <w:pPr>
+        <w:ind w:left="1800" w:hanging="360"/>
+      </w:pPr>
+      <w:rPr>
+        <w:rFonts w:ascii="Wingdings" w:hAnsi="Wingdings" w:hint="default"/>
+      </w:rPr>
+    </w:lvl>
+    <w:lvl w:ilvl="3" w:tplc="08090001" w:tentative="1">
+      <w:start w:val="1"/>
+      <w:numFmt w:val="bullet"/>
+      <w:lvlText w:val=""/>
+      <w:lvlJc w:val="left"/>
+      <w:pPr>
+        <w:ind w:left="2520" w:hanging="360"/>
+      </w:pPr>
+      <w:rPr>
+        <w:rFonts w:ascii="Symbol" w:hAnsi="Symbol" w:hint="default"/>
+      </w:rPr>
+    </w:lvl>
+    <w:lvl w:ilvl="4" w:tplc="08090003" w:tentative="1">
+      <w:start w:val="1"/>
+      <w:numFmt w:val="bullet"/>
+      <w:lvlText w:val="o"/>
+      <w:lvlJc w:val="left"/>
+      <w:pPr>
+        <w:ind w:left="3240" w:hanging="360"/>
+      </w:pPr>
+      <w:rPr>
+        <w:rFonts w:ascii="Courier New" w:hAnsi="Courier New" w:cs="Courier New" w:hint="default"/>
+      </w:rPr>
+    </w:lvl>
+    <w:lvl w:ilvl="5" w:tplc="08090005" w:tentative="1">
+      <w:start w:val="1"/>
+      <w:numFmt w:val="bullet"/>
+      <w:lvlText w:val=""/>
+      <w:lvlJc w:val="left"/>
+      <w:pPr>
+        <w:ind w:left="3960" w:hanging="360"/>
+      </w:pPr>
+      <w:rPr>
+        <w:rFonts w:ascii="Wingdings" w:hAnsi="Wingdings" w:hint="default"/>
+      </w:rPr>
+    </w:lvl>
+    <w:lvl w:ilvl="6" w:tplc="08090001" w:tentative="1">
+      <w:start w:val="1"/>
+      <w:numFmt w:val="bullet"/>
+      <w:lvlText w:val=""/>
+      <w:lvlJc w:val="left"/>
+      <w:pPr>
+        <w:ind w:left="4680" w:hanging="360"/>
+      </w:pPr>
+      <w:rPr>
+        <w:rFonts w:ascii="Symbol" w:hAnsi="Symbol" w:hint="default"/>
+      </w:rPr>
+    </w:lvl>
+    <w:lvl w:ilvl="7" w:tplc="08090003" w:tentative="1">
+      <w:start w:val="1"/>
+      <w:numFmt w:val="bullet"/>
+      <w:lvlText w:val="o"/>
+      <w:lvlJc w:val="left"/>
+      <w:pPr>
+        <w:ind w:left="5400" w:hanging="360"/>
+      </w:pPr>
+      <w:rPr>
+        <w:rFonts w:ascii="Courier New" w:hAnsi="Courier New" w:cs="Courier New" w:hint="default"/>
+      </w:rPr>
+    </w:lvl>
+    <w:lvl w:ilvl="8" w:tplc="08090005" w:tentative="1">
+      <w:start w:val="1"/>
+      <w:numFmt w:val="bullet"/>
+      <w:lvlText w:val=""/>
+      <w:lvlJc w:val="left"/>
+      <w:pPr>
+        <w:ind w:left="6120" w:hanging="360"/>
+      </w:pPr>
+      <w:rPr>
+        <w:rFonts w:ascii="Wingdings" w:hAnsi="Wingdings" w:hint="default"/>
+      </w:rPr>
+    </w:lvl>
+  </w:abstractNum>
+  <w:abstractNum w:abstractNumId="32" w15:restartNumberingAfterBreak="0">
     <w:nsid w:val="79E94091"/>
     <w:multiLevelType w:val="hybridMultilevel"/>
     <w:tmpl w:val="1D2685E2"/>
@@ -10077,85 +11184,103 @@
     </w:lvl>
   </w:abstractNum>
   <w:num w:numId="1" w16cid:durableId="1021855189">
+    <w:abstractNumId w:val="4"/>
+  </w:num>
+  <w:num w:numId="2" w16cid:durableId="873617365">
+    <w:abstractNumId w:val="14"/>
+  </w:num>
+  <w:num w:numId="3" w16cid:durableId="415858473">
+    <w:abstractNumId w:val="8"/>
+  </w:num>
+  <w:num w:numId="4" w16cid:durableId="1934240272">
+    <w:abstractNumId w:val="27"/>
+  </w:num>
+  <w:num w:numId="5" w16cid:durableId="500319591">
+    <w:abstractNumId w:val="10"/>
+  </w:num>
+  <w:num w:numId="6" w16cid:durableId="1953244164">
+    <w:abstractNumId w:val="25"/>
+  </w:num>
+  <w:num w:numId="7" w16cid:durableId="1272973944">
+    <w:abstractNumId w:val="5"/>
+  </w:num>
+  <w:num w:numId="8" w16cid:durableId="296837842">
+    <w:abstractNumId w:val="24"/>
+  </w:num>
+  <w:num w:numId="9" w16cid:durableId="1612740194">
+    <w:abstractNumId w:val="7"/>
+  </w:num>
+  <w:num w:numId="10" w16cid:durableId="1126045997">
+    <w:abstractNumId w:val="6"/>
+  </w:num>
+  <w:num w:numId="11" w16cid:durableId="409622807">
     <w:abstractNumId w:val="3"/>
   </w:num>
-  <w:num w:numId="2" w16cid:durableId="873617365">
+  <w:num w:numId="12" w16cid:durableId="57019460">
+    <w:abstractNumId w:val="17"/>
+  </w:num>
+  <w:num w:numId="13" w16cid:durableId="1135102731">
+    <w:abstractNumId w:val="12"/>
+  </w:num>
+  <w:num w:numId="14" w16cid:durableId="2040273535">
     <w:abstractNumId w:val="13"/>
   </w:num>
-  <w:num w:numId="3" w16cid:durableId="415858473">
-    <w:abstractNumId w:val="7"/>
+  <w:num w:numId="15" w16cid:durableId="2078088890">
+    <w:abstractNumId w:val="19"/>
   </w:num>
-  <w:num w:numId="4" w16cid:durableId="1934240272">
+  <w:num w:numId="16" w16cid:durableId="224148914">
+    <w:abstractNumId w:val="2"/>
+  </w:num>
+  <w:num w:numId="17" w16cid:durableId="1422144515">
+    <w:abstractNumId w:val="9"/>
+  </w:num>
+  <w:num w:numId="18" w16cid:durableId="1168524478">
+    <w:abstractNumId w:val="29"/>
+  </w:num>
+  <w:num w:numId="19" w16cid:durableId="1477914169">
+    <w:abstractNumId w:val="26"/>
+  </w:num>
+  <w:num w:numId="20" w16cid:durableId="1623457808">
+    <w:abstractNumId w:val="11"/>
+  </w:num>
+  <w:num w:numId="21" w16cid:durableId="1264651575">
+    <w:abstractNumId w:val="18"/>
+  </w:num>
+  <w:num w:numId="22" w16cid:durableId="671879580">
+    <w:abstractNumId w:val="21"/>
+  </w:num>
+  <w:num w:numId="23" w16cid:durableId="850948606">
+    <w:abstractNumId w:val="32"/>
+  </w:num>
+  <w:num w:numId="24" w16cid:durableId="440616153">
+    <w:abstractNumId w:val="1"/>
+  </w:num>
+  <w:num w:numId="25" w16cid:durableId="1892769113">
+    <w:abstractNumId w:val="28"/>
+  </w:num>
+  <w:num w:numId="26" w16cid:durableId="1310551058">
+    <w:abstractNumId w:val="20"/>
+  </w:num>
+  <w:num w:numId="27" w16cid:durableId="937251674">
+    <w:abstractNumId w:val="30"/>
+  </w:num>
+  <w:num w:numId="28" w16cid:durableId="1176579910">
+    <w:abstractNumId w:val="23"/>
+  </w:num>
+  <w:num w:numId="29" w16cid:durableId="564145885">
+    <w:abstractNumId w:val="0"/>
+  </w:num>
+  <w:num w:numId="30" w16cid:durableId="2037729497">
+    <w:abstractNumId w:val="31"/>
+  </w:num>
+  <w:num w:numId="31" w16cid:durableId="1972712446">
     <w:abstractNumId w:val="22"/>
   </w:num>
-  <w:num w:numId="5" w16cid:durableId="500319591">
-    <w:abstractNumId w:val="9"/>
-  </w:num>
-  <w:num w:numId="6" w16cid:durableId="1953244164">
-    <w:abstractNumId w:val="20"/>
-  </w:num>
-  <w:num w:numId="7" w16cid:durableId="1272973944">
-    <w:abstractNumId w:val="4"/>
-  </w:num>
-  <w:num w:numId="8" w16cid:durableId="296837842">
-    <w:abstractNumId w:val="19"/>
-  </w:num>
-  <w:num w:numId="9" w16cid:durableId="1612740194">
-    <w:abstractNumId w:val="6"/>
-  </w:num>
-  <w:num w:numId="10" w16cid:durableId="1126045997">
-    <w:abstractNumId w:val="5"/>
-  </w:num>
-  <w:num w:numId="11" w16cid:durableId="409622807">
-    <w:abstractNumId w:val="2"/>
-  </w:num>
-  <w:num w:numId="12" w16cid:durableId="57019460">
-    <w:abstractNumId w:val="14"/>
-  </w:num>
-  <w:num w:numId="13" w16cid:durableId="1135102731">
-    <w:abstractNumId w:val="11"/>
-  </w:num>
-  <w:num w:numId="14" w16cid:durableId="2040273535">
-    <w:abstractNumId w:val="12"/>
-  </w:num>
-  <w:num w:numId="15" w16cid:durableId="2078088890">
+  <w:num w:numId="32" w16cid:durableId="325481554">
     <w:abstractNumId w:val="16"/>
   </w:num>
-  <w:num w:numId="16" w16cid:durableId="224148914">
-    <w:abstractNumId w:val="1"/>
-  </w:num>
-  <w:num w:numId="17" w16cid:durableId="1422144515">
-    <w:abstractNumId w:val="8"/>
-  </w:num>
-  <w:num w:numId="18" w16cid:durableId="1168524478">
-    <w:abstractNumId w:val="24"/>
-  </w:num>
-  <w:num w:numId="19" w16cid:durableId="1477914169">
-    <w:abstractNumId w:val="21"/>
-  </w:num>
-  <w:num w:numId="20" w16cid:durableId="1623457808">
-    <w:abstractNumId w:val="10"/>
-  </w:num>
-  <w:num w:numId="21" w16cid:durableId="1264651575">
+  <w:num w:numId="33" w16cid:durableId="1457026527">
     <w:abstractNumId w:val="15"/>
-  </w:num>
-  <w:num w:numId="22" w16cid:durableId="671879580">
-    <w:abstractNumId w:val="18"/>
-  </w:num>
-  <w:num w:numId="23" w16cid:durableId="850948606">
-    <w:abstractNumId w:val="26"/>
-  </w:num>
-  <w:num w:numId="24" w16cid:durableId="440616153">
-    <w:abstractNumId w:val="0"/>
-  </w:num>
-  <w:num w:numId="25" w16cid:durableId="1892769113">
-    <w:abstractNumId w:val="23"/>
-  </w:num>
-  <w:num w:numId="26" w16cid:durableId="1310551058">
-    <w:abstractNumId w:val="17"/>
-  </w:num>
-  <w:num w:numId="27" w16cid:durableId="937251674">
-    <w:abstractNumId w:val="25"/>
   </w:num>
 </w:numbering>
 </file>
@@ -11473,6 +12598,7 @@
   </w:compat>
   <w:rsids>
     <w:rsidRoot w:val="00A80C73"/>
+    <w:rsid w:val="00080750"/>
     <w:rsid w:val="000D1C25"/>
     <w:rsid w:val="0012679A"/>
     <w:rsid w:val="001A42E8"/>
@@ -11483,14 +12609,18 @@
     <w:rsid w:val="0066102B"/>
     <w:rsid w:val="006B5931"/>
     <w:rsid w:val="007C1B1A"/>
+    <w:rsid w:val="00866A9B"/>
     <w:rsid w:val="00964D45"/>
     <w:rsid w:val="00971F34"/>
+    <w:rsid w:val="00A06863"/>
     <w:rsid w:val="00A80C73"/>
     <w:rsid w:val="00A92441"/>
     <w:rsid w:val="00B64356"/>
     <w:rsid w:val="00D35F5A"/>
     <w:rsid w:val="00D6146C"/>
+    <w:rsid w:val="00DB3CBF"/>
     <w:rsid w:val="00DC0342"/>
+    <w:rsid w:val="00E5110E"/>
     <w:rsid w:val="00F14FFC"/>
     <w:rsid w:val="00FC7FCD"/>
   </w:rsids>

</xml_diff>

<commit_message>
Added Non-Functional Requirements and Risks
</commit_message>
<xml_diff>
--- a/Task1_Proposal_717903_Ram_D.docx
+++ b/Task1_Proposal_717903_Ram_D.docx
@@ -1332,7 +1332,21 @@
                 <w:rStyle w:val="Hyperlink"/>
                 <w:noProof/>
               </w:rPr>
-              <w:t>Performance</w:t>
+              <w:t>Perfor</w:t>
+            </w:r>
+            <w:r>
+              <w:rPr>
+                <w:rStyle w:val="Hyperlink"/>
+                <w:noProof/>
+              </w:rPr>
+              <w:t>m</w:t>
+            </w:r>
+            <w:r>
+              <w:rPr>
+                <w:rStyle w:val="Hyperlink"/>
+                <w:noProof/>
+              </w:rPr>
+              <w:t>ance</w:t>
             </w:r>
             <w:r>
               <w:rPr>
@@ -4261,10 +4275,7 @@
               </w:numPr>
             </w:pPr>
             <w:r>
-              <w:t>View discount type field on product</w:t>
-            </w:r>
-            <w:r>
-              <w:t xml:space="preserve"> specific page</w:t>
+              <w:t>View discount type field on product specific page</w:t>
             </w:r>
           </w:p>
           <w:p>
@@ -4276,13 +4287,7 @@
               </w:numPr>
             </w:pPr>
             <w:r>
-              <w:t xml:space="preserve">Interact with </w:t>
-            </w:r>
-            <w:r>
-              <w:t>discount type field on product specific page</w:t>
-            </w:r>
-            <w:r>
-              <w:t xml:space="preserve"> to change discount type only if the product is of the producer</w:t>
+              <w:t>Interact with discount type field on product specific page to change discount type only if the product is of the producer</w:t>
             </w:r>
           </w:p>
           <w:p>
@@ -4400,10 +4405,7 @@
               <w:t>View font size adjustment buttons</w:t>
             </w:r>
             <w:r>
-              <w:t xml:space="preserve"> </w:t>
-            </w:r>
-            <w:r>
-              <w:t>on navigation bar</w:t>
+              <w:t xml:space="preserve"> on navigation bar</w:t>
             </w:r>
           </w:p>
           <w:p>
@@ -4415,13 +4417,7 @@
               </w:numPr>
             </w:pPr>
             <w:r>
-              <w:t xml:space="preserve">Interact with </w:t>
-            </w:r>
-            <w:r>
-              <w:t>theme switch button</w:t>
-            </w:r>
-            <w:r>
-              <w:t xml:space="preserve"> to change between light mode and dark mode</w:t>
+              <w:t>Interact with theme switch button to change between light mode and dark mode</w:t>
             </w:r>
           </w:p>
           <w:p>
@@ -4433,13 +4429,7 @@
               </w:numPr>
             </w:pPr>
             <w:r>
-              <w:t xml:space="preserve">Interact with </w:t>
-            </w:r>
-            <w:r>
-              <w:t>text-to-speech button</w:t>
-            </w:r>
-            <w:r>
-              <w:t xml:space="preserve"> to use text-to-speech</w:t>
+              <w:t>Interact with text-to-speech button to use text-to-speech</w:t>
             </w:r>
           </w:p>
           <w:p>
@@ -4451,13 +4441,7 @@
               </w:numPr>
             </w:pPr>
             <w:r>
-              <w:t xml:space="preserve">Interact with </w:t>
-            </w:r>
-            <w:r>
-              <w:t>font size adjustment buttons</w:t>
-            </w:r>
-            <w:r>
-              <w:t xml:space="preserve"> to increase or decrease font size</w:t>
+              <w:t>Interact with font size adjustment buttons to increase or decrease font size</w:t>
             </w:r>
           </w:p>
         </w:tc>
@@ -5017,6 +5001,97 @@
           </w:p>
         </w:tc>
       </w:tr>
+      <w:tr>
+        <w:tc>
+          <w:tcPr>
+            <w:tcW w:w="3005" w:type="dxa"/>
+          </w:tcPr>
+          <w:p>
+            <w:r>
+              <w:lastRenderedPageBreak/>
+              <w:t>Payment should be processed quickly.</w:t>
+            </w:r>
+          </w:p>
+        </w:tc>
+        <w:tc>
+          <w:tcPr>
+            <w:tcW w:w="3005" w:type="dxa"/>
+          </w:tcPr>
+          <w:p>
+            <w:r>
+              <w:t>This will allow the customers to feel like that the website is responsive as it will not take long to process the payment.</w:t>
+            </w:r>
+          </w:p>
+        </w:tc>
+        <w:tc>
+          <w:tcPr>
+            <w:tcW w:w="3006" w:type="dxa"/>
+          </w:tcPr>
+          <w:p>
+            <w:r>
+              <w:t>The payment should be at an industry standard.</w:t>
+            </w:r>
+          </w:p>
+        </w:tc>
+      </w:tr>
+      <w:tr>
+        <w:tc>
+          <w:tcPr>
+            <w:tcW w:w="3005" w:type="dxa"/>
+          </w:tcPr>
+          <w:p>
+            <w:r>
+              <w:t>Orders’</w:t>
+            </w:r>
+            <w:r>
+              <w:t xml:space="preserve"> status should be updated fast when changed</w:t>
+            </w:r>
+            <w:r>
+              <w:t>.</w:t>
+            </w:r>
+          </w:p>
+        </w:tc>
+        <w:tc>
+          <w:tcPr>
+            <w:tcW w:w="3005" w:type="dxa"/>
+          </w:tcPr>
+          <w:p>
+            <w:r>
+              <w:t xml:space="preserve">This will allow the customers to view their </w:t>
+            </w:r>
+            <w:r>
+              <w:t>orders</w:t>
+            </w:r>
+            <w:r>
+              <w:t xml:space="preserve"> fast and not get frustrated since they were not able to view the </w:t>
+            </w:r>
+            <w:r>
+              <w:t>orders’</w:t>
+            </w:r>
+            <w:r>
+              <w:t xml:space="preserve"> status change fast.</w:t>
+            </w:r>
+          </w:p>
+        </w:tc>
+        <w:tc>
+          <w:tcPr>
+            <w:tcW w:w="3006" w:type="dxa"/>
+          </w:tcPr>
+          <w:p>
+            <w:r>
+              <w:t>Orders’</w:t>
+            </w:r>
+            <w:r>
+              <w:t xml:space="preserve"> status being updated under 2 minutes after the status has been changed</w:t>
+            </w:r>
+          </w:p>
+          <w:p>
+            <w:r>
+              <w:tab/>
+            </w:r>
+          </w:p>
+        </w:tc>
+      </w:tr>
     </w:tbl>
     <w:p/>
     <w:p>
@@ -5327,19 +5402,100 @@
           <w:tcPr>
             <w:tcW w:w="3005" w:type="dxa"/>
           </w:tcPr>
-          <w:p/>
+          <w:p>
+            <w:r>
+              <w:t>Account details of the user should be censored.</w:t>
+            </w:r>
+          </w:p>
         </w:tc>
         <w:tc>
           <w:tcPr>
             <w:tcW w:w="3005" w:type="dxa"/>
           </w:tcPr>
-          <w:p/>
+          <w:p>
+            <w:r>
+              <w:t>This will ensure others cannot access details of the user, by viewing the user’s screen.</w:t>
+            </w:r>
+          </w:p>
         </w:tc>
         <w:tc>
           <w:tcPr>
             <w:tcW w:w="3006" w:type="dxa"/>
           </w:tcPr>
-          <w:p/>
+          <w:p>
+            <w:r>
+              <w:t>Important details like passwords and emails will be replaced with asterisks or dots, these will be the same amount regardless the number of characters.</w:t>
+            </w:r>
+          </w:p>
+        </w:tc>
+      </w:tr>
+      <w:tr>
+        <w:tc>
+          <w:tcPr>
+            <w:tcW w:w="3005" w:type="dxa"/>
+          </w:tcPr>
+          <w:p>
+            <w:r>
+              <w:t>Payment details should not be shown on the screen by default.</w:t>
+            </w:r>
+          </w:p>
+        </w:tc>
+        <w:tc>
+          <w:tcPr>
+            <w:tcW w:w="3005" w:type="dxa"/>
+          </w:tcPr>
+          <w:p>
+            <w:r>
+              <w:t>This will ensure the customers’ details will not be stolen by someone viewing their screen when they are entering their payment details.</w:t>
+            </w:r>
+          </w:p>
+        </w:tc>
+        <w:tc>
+          <w:tcPr>
+            <w:tcW w:w="3006" w:type="dxa"/>
+          </w:tcPr>
+          <w:p>
+            <w:r>
+              <w:t xml:space="preserve">Card numbers will be replaced with asterisks or dots, when they are being typed in or just being displayed. </w:t>
+            </w:r>
+          </w:p>
+          <w:p>
+            <w:r>
+              <w:t>Card holder’s full name should be abbreviated to only show the surname on screen.</w:t>
+            </w:r>
+          </w:p>
+        </w:tc>
+      </w:tr>
+      <w:tr>
+        <w:tc>
+          <w:tcPr>
+            <w:tcW w:w="3005" w:type="dxa"/>
+          </w:tcPr>
+          <w:p>
+            <w:r>
+              <w:t>Users given specific roles</w:t>
+            </w:r>
+          </w:p>
+        </w:tc>
+        <w:tc>
+          <w:tcPr>
+            <w:tcW w:w="3005" w:type="dxa"/>
+          </w:tcPr>
+          <w:p>
+            <w:r>
+              <w:t>This will ensure the users that are not supposed have access to certain pages will not have to access to it.</w:t>
+            </w:r>
+          </w:p>
+        </w:tc>
+        <w:tc>
+          <w:tcPr>
+            <w:tcW w:w="3006" w:type="dxa"/>
+          </w:tcPr>
+          <w:p>
+            <w:r>
+              <w:t>Users are only able to view pages that they are allowed based on their roles.</w:t>
+            </w:r>
+          </w:p>
         </w:tc>
       </w:tr>
     </w:tbl>
@@ -5579,6 +5735,50 @@
           </w:p>
         </w:tc>
       </w:tr>
+      <w:tr>
+        <w:tc>
+          <w:tcPr>
+            <w:tcW w:w="3005" w:type="dxa"/>
+          </w:tcPr>
+          <w:p>
+            <w:r>
+              <w:t>The website should be able to store data of many customers without overwriting previous data of other customers.</w:t>
+            </w:r>
+          </w:p>
+        </w:tc>
+        <w:tc>
+          <w:tcPr>
+            <w:tcW w:w="3005" w:type="dxa"/>
+          </w:tcPr>
+          <w:p>
+            <w:r>
+              <w:t xml:space="preserve">This will allow the website to handle the storage customers’ details and </w:t>
+            </w:r>
+            <w:r>
+              <w:t>orders</w:t>
+            </w:r>
+            <w:r>
+              <w:t xml:space="preserve">, without cost the constant need to upgrade the storage. Additionally, it will avoid customers getting frustrated if they website cannot store their details or </w:t>
+            </w:r>
+            <w:r>
+              <w:t>orders</w:t>
+            </w:r>
+            <w:r>
+              <w:t>.</w:t>
+            </w:r>
+          </w:p>
+        </w:tc>
+        <w:tc>
+          <w:tcPr>
+            <w:tcW w:w="3006" w:type="dxa"/>
+          </w:tcPr>
+          <w:p>
+            <w:r>
+              <w:t>The website should be able to store up to 10TB of data.</w:t>
+            </w:r>
+          </w:p>
+        </w:tc>
+      </w:tr>
     </w:tbl>
     <w:p/>
     <w:p>
@@ -5733,11 +5933,7 @@
           </w:tcPr>
           <w:p>
             <w:r>
-              <w:t xml:space="preserve">This will ensure that website will still be providing a smooth </w:t>
-            </w:r>
-            <w:r>
-              <w:lastRenderedPageBreak/>
-              <w:t>experience even if there is an increase in users.</w:t>
+              <w:t>This will ensure that website will still be providing a smooth experience even if there is an increase in users.</w:t>
             </w:r>
           </w:p>
         </w:tc>
@@ -5747,8 +5943,42 @@
           </w:tcPr>
           <w:p>
             <w:r>
-              <w:lastRenderedPageBreak/>
               <w:t>On average traffic should be dispersed evenly across all the different servers.</w:t>
+            </w:r>
+          </w:p>
+        </w:tc>
+      </w:tr>
+      <w:tr>
+        <w:trPr>
+          <w:trHeight w:val="263"/>
+        </w:trPr>
+        <w:tc>
+          <w:tcPr>
+            <w:tcW w:w="3005" w:type="dxa"/>
+          </w:tcPr>
+          <w:p>
+            <w:r>
+              <w:t>The code should be easily maintained and understandable by others.</w:t>
+            </w:r>
+          </w:p>
+        </w:tc>
+        <w:tc>
+          <w:tcPr>
+            <w:tcW w:w="3005" w:type="dxa"/>
+          </w:tcPr>
+          <w:p>
+            <w:r>
+              <w:t>This will allow the website to get more features more efficiently as other developers can understand the code easily.</w:t>
+            </w:r>
+          </w:p>
+        </w:tc>
+        <w:tc>
+          <w:tcPr>
+            <w:tcW w:w="3006" w:type="dxa"/>
+          </w:tcPr>
+          <w:p>
+            <w:r>
+              <w:t>A third party should be able to understand the coding conventions and logic being used in the solution and edit the code easily after a week of reviewing.</w:t>
             </w:r>
           </w:p>
         </w:tc>
@@ -5919,6 +6149,7 @@
           </w:tcPr>
           <w:p>
             <w:r>
+              <w:lastRenderedPageBreak/>
               <w:t>Websit</w:t>
             </w:r>
             <w:r>
@@ -6079,6 +6310,41 @@
             </w:r>
             <w:r>
               <w:t>to the design document of the website.</w:t>
+            </w:r>
+          </w:p>
+        </w:tc>
+      </w:tr>
+      <w:tr>
+        <w:trPr>
+          <w:trHeight w:val="935"/>
+        </w:trPr>
+        <w:tc>
+          <w:tcPr>
+            <w:tcW w:w="3005" w:type="dxa"/>
+          </w:tcPr>
+          <w:p>
+            <w:r>
+              <w:t>The solution must show errors in an informative and understandable way.</w:t>
+            </w:r>
+          </w:p>
+        </w:tc>
+        <w:tc>
+          <w:tcPr>
+            <w:tcW w:w="3005" w:type="dxa"/>
+          </w:tcPr>
+          <w:p>
+            <w:r>
+              <w:t>This will ensure users do not get frustrated, if they have errors in the input or output of the solution. Additionally, this will allow the website to be professional, as it is to industry standard to show error in an informative and understandable manner.</w:t>
+            </w:r>
+          </w:p>
+        </w:tc>
+        <w:tc>
+          <w:tcPr>
+            <w:tcW w:w="3006" w:type="dxa"/>
+          </w:tcPr>
+          <w:p>
+            <w:r>
+              <w:t>Users should not have no complaints of them being confused or frustrated with errors.</w:t>
             </w:r>
           </w:p>
         </w:tc>
@@ -6271,11 +6537,14 @@
         <w:pStyle w:val="ListParagraph"/>
         <w:numPr>
           <w:ilvl w:val="0"/>
-          <w:numId w:val="27"/>
+          <w:numId w:val="35"/>
         </w:numPr>
       </w:pPr>
       <w:r>
-        <w:t>PBR 1</w:t>
+        <w:t>Ordering</w:t>
+      </w:r>
+      <w:r>
+        <w:t xml:space="preserve"> system errors </w:t>
       </w:r>
     </w:p>
     <w:p>
@@ -6283,11 +6552,11 @@
         <w:pStyle w:val="ListParagraph"/>
         <w:numPr>
           <w:ilvl w:val="0"/>
-          <w:numId w:val="27"/>
+          <w:numId w:val="35"/>
         </w:numPr>
       </w:pPr>
       <w:r>
-        <w:t>PBR 2</w:t>
+        <w:t xml:space="preserve">Back-end access by unauthorised users </w:t>
       </w:r>
     </w:p>
     <w:p>
@@ -6295,11 +6564,11 @@
         <w:pStyle w:val="ListParagraph"/>
         <w:numPr>
           <w:ilvl w:val="0"/>
-          <w:numId w:val="27"/>
+          <w:numId w:val="35"/>
         </w:numPr>
       </w:pPr>
       <w:r>
-        <w:t>PBR 3</w:t>
+        <w:t>Payment provider not working</w:t>
       </w:r>
     </w:p>
     <w:p>
@@ -6307,12 +6576,11 @@
         <w:pStyle w:val="ListParagraph"/>
         <w:numPr>
           <w:ilvl w:val="0"/>
-          <w:numId w:val="27"/>
+          <w:numId w:val="35"/>
         </w:numPr>
       </w:pPr>
       <w:r>
-        <w:lastRenderedPageBreak/>
-        <w:t>PBR 4</w:t>
+        <w:t>Producers adding wrong product details</w:t>
       </w:r>
     </w:p>
     <w:p>
@@ -6320,11 +6588,11 @@
         <w:pStyle w:val="ListParagraph"/>
         <w:numPr>
           <w:ilvl w:val="0"/>
-          <w:numId w:val="27"/>
+          <w:numId w:val="35"/>
         </w:numPr>
       </w:pPr>
       <w:r>
-        <w:t>PBR 5</w:t>
+        <w:t>Incorrect stock and availability</w:t>
       </w:r>
     </w:p>
     <w:p>
@@ -6332,74 +6600,20 @@
         <w:pStyle w:val="ListParagraph"/>
         <w:numPr>
           <w:ilvl w:val="0"/>
-          <w:numId w:val="27"/>
+          <w:numId w:val="35"/>
         </w:numPr>
       </w:pPr>
       <w:r>
-        <w:t>PBR 6</w:t>
+        <w:t>Producer struggling to adopt using the dashboard</w:t>
       </w:r>
     </w:p>
     <w:p>
       <w:pPr>
-        <w:pStyle w:val="ListParagraph"/>
-        <w:numPr>
-          <w:ilvl w:val="0"/>
-          <w:numId w:val="27"/>
-        </w:numPr>
-      </w:pPr>
-      <w:r>
-        <w:t xml:space="preserve">PBR </w:t>
-      </w:r>
-      <w:r>
-        <w:t>7</w:t>
-      </w:r>
-    </w:p>
-    <w:p>
-      <w:pPr>
-        <w:pStyle w:val="ListParagraph"/>
-        <w:numPr>
-          <w:ilvl w:val="0"/>
-          <w:numId w:val="27"/>
-        </w:numPr>
-      </w:pPr>
-      <w:r>
-        <w:t>PBR 8</w:t>
-      </w:r>
-    </w:p>
-    <w:p/>
-    <w:p/>
-    <w:p>
-      <w:pPr>
-        <w:pStyle w:val="Heading2"/>
-      </w:pPr>
-    </w:p>
-    <w:p>
-      <w:pPr>
-        <w:pStyle w:val="Heading2"/>
-      </w:pPr>
-    </w:p>
-    <w:p>
-      <w:pPr>
-        <w:pStyle w:val="Heading2"/>
-      </w:pPr>
-    </w:p>
-    <w:p>
-      <w:pPr>
-        <w:pStyle w:val="Heading2"/>
-      </w:pPr>
-    </w:p>
-    <w:p>
-      <w:pPr>
-        <w:pStyle w:val="Heading2"/>
-      </w:pPr>
-    </w:p>
-    <w:p/>
-    <w:p>
-      <w:pPr>
         <w:pStyle w:val="Heading2"/>
       </w:pPr>
       <w:bookmarkStart w:id="31" w:name="_Toc223976673"/>
       <w:r>
+        <w:lastRenderedPageBreak/>
         <w:t>Risk Matrix</w:t>
       </w:r>
       <w:bookmarkEnd w:id="31"/>
@@ -6527,6 +6741,12 @@
               </w:rPr>
               <w:t>GPR3, GTR6</w:t>
             </w:r>
+            <w:r>
+              <w:rPr>
+                <w:highlight w:val="red"/>
+              </w:rPr>
+              <w:t>, PBR2</w:t>
+            </w:r>
           </w:p>
         </w:tc>
         <w:tc>
@@ -6546,6 +6766,18 @@
               </w:rPr>
               <w:t>GPR1, GPR2, GTR4</w:t>
             </w:r>
+            <w:r>
+              <w:rPr>
+                <w:highlight w:val="red"/>
+              </w:rPr>
+              <w:t>, PBR1, PBR3</w:t>
+            </w:r>
+            <w:r>
+              <w:rPr>
+                <w:highlight w:val="red"/>
+              </w:rPr>
+              <w:t>, PBR5</w:t>
+            </w:r>
           </w:p>
         </w:tc>
         <w:tc>
@@ -6559,6 +6791,12 @@
                 <w:highlight w:val="red"/>
               </w:rPr>
             </w:pPr>
+            <w:r>
+              <w:rPr>
+                <w:highlight w:val="red"/>
+              </w:rPr>
+              <w:t>PBR6</w:t>
+            </w:r>
           </w:p>
         </w:tc>
       </w:tr>
@@ -6612,7 +6850,11 @@
             <w:tcW w:w="1276" w:type="dxa"/>
             <w:shd w:val="clear" w:color="auto" w:fill="FA0000"/>
           </w:tcPr>
-          <w:p/>
+          <w:p>
+            <w:r>
+              <w:t>PBR4</w:t>
+            </w:r>
+          </w:p>
         </w:tc>
       </w:tr>
       <w:tr>
@@ -7219,7 +7461,7 @@
           </w:tcPr>
           <w:p>
             <w:r>
-              <w:t>PBR 1</w:t>
+              <w:t xml:space="preserve">Ordering system errors </w:t>
             </w:r>
           </w:p>
         </w:tc>
@@ -7227,13 +7469,21 @@
           <w:tcPr>
             <w:tcW w:w="1276" w:type="dxa"/>
           </w:tcPr>
-          <w:p/>
+          <w:p>
+            <w:r>
+              <w:t>Significant</w:t>
+            </w:r>
+          </w:p>
         </w:tc>
         <w:tc>
           <w:tcPr>
             <w:tcW w:w="1217" w:type="dxa"/>
           </w:tcPr>
-          <w:p/>
+          <w:p>
+            <w:r>
+              <w:t>High</w:t>
+            </w:r>
+          </w:p>
         </w:tc>
       </w:tr>
       <w:tr>
@@ -7243,8 +7493,7 @@
           </w:tcPr>
           <w:p>
             <w:r>
-              <w:lastRenderedPageBreak/>
-              <w:t>PBR 2</w:t>
+              <w:t xml:space="preserve">Back-end access by unauthorised users </w:t>
             </w:r>
           </w:p>
         </w:tc>
@@ -7252,13 +7501,21 @@
           <w:tcPr>
             <w:tcW w:w="1276" w:type="dxa"/>
           </w:tcPr>
-          <w:p/>
+          <w:p>
+            <w:r>
+              <w:t>Moderate</w:t>
+            </w:r>
+          </w:p>
         </w:tc>
         <w:tc>
           <w:tcPr>
             <w:tcW w:w="1217" w:type="dxa"/>
           </w:tcPr>
-          <w:p/>
+          <w:p>
+            <w:r>
+              <w:t>High</w:t>
+            </w:r>
+          </w:p>
         </w:tc>
       </w:tr>
       <w:tr>
@@ -7268,7 +7525,7 @@
           </w:tcPr>
           <w:p>
             <w:r>
-              <w:t>PBR 3</w:t>
+              <w:t>Payment provider not working</w:t>
             </w:r>
           </w:p>
         </w:tc>
@@ -7276,13 +7533,21 @@
           <w:tcPr>
             <w:tcW w:w="1276" w:type="dxa"/>
           </w:tcPr>
-          <w:p/>
+          <w:p>
+            <w:r>
+              <w:t>Significant</w:t>
+            </w:r>
+          </w:p>
         </w:tc>
         <w:tc>
           <w:tcPr>
             <w:tcW w:w="1217" w:type="dxa"/>
           </w:tcPr>
-          <w:p/>
+          <w:p>
+            <w:r>
+              <w:t>High</w:t>
+            </w:r>
+          </w:p>
         </w:tc>
       </w:tr>
       <w:tr>
@@ -7292,7 +7557,7 @@
           </w:tcPr>
           <w:p>
             <w:r>
-              <w:t>PBR 4</w:t>
+              <w:t>Producers adding wrong product details</w:t>
             </w:r>
           </w:p>
         </w:tc>
@@ -7300,13 +7565,85 @@
           <w:tcPr>
             <w:tcW w:w="1276" w:type="dxa"/>
           </w:tcPr>
-          <w:p/>
+          <w:p>
+            <w:r>
+              <w:t>High</w:t>
+            </w:r>
+          </w:p>
         </w:tc>
         <w:tc>
           <w:tcPr>
             <w:tcW w:w="1217" w:type="dxa"/>
           </w:tcPr>
-          <w:p/>
+          <w:p>
+            <w:r>
+              <w:t>Significant</w:t>
+            </w:r>
+          </w:p>
+        </w:tc>
+      </w:tr>
+      <w:tr>
+        <w:tc>
+          <w:tcPr>
+            <w:tcW w:w="6516" w:type="dxa"/>
+          </w:tcPr>
+          <w:p>
+            <w:r>
+              <w:t>Incorrect stock and availability</w:t>
+            </w:r>
+          </w:p>
+        </w:tc>
+        <w:tc>
+          <w:tcPr>
+            <w:tcW w:w="1276" w:type="dxa"/>
+          </w:tcPr>
+          <w:p>
+            <w:r>
+              <w:t>Significant</w:t>
+            </w:r>
+          </w:p>
+        </w:tc>
+        <w:tc>
+          <w:tcPr>
+            <w:tcW w:w="1217" w:type="dxa"/>
+          </w:tcPr>
+          <w:p>
+            <w:r>
+              <w:t>High</w:t>
+            </w:r>
+          </w:p>
+        </w:tc>
+      </w:tr>
+      <w:tr>
+        <w:tc>
+          <w:tcPr>
+            <w:tcW w:w="6516" w:type="dxa"/>
+          </w:tcPr>
+          <w:p>
+            <w:r>
+              <w:t>Producer struggling to adopt using the dashboard</w:t>
+            </w:r>
+          </w:p>
+        </w:tc>
+        <w:tc>
+          <w:tcPr>
+            <w:tcW w:w="1276" w:type="dxa"/>
+          </w:tcPr>
+          <w:p>
+            <w:r>
+              <w:t>High</w:t>
+            </w:r>
+          </w:p>
+        </w:tc>
+        <w:tc>
+          <w:tcPr>
+            <w:tcW w:w="1217" w:type="dxa"/>
+          </w:tcPr>
+          <w:p>
+            <w:r>
+              <w:t>High</w:t>
+            </w:r>
+          </w:p>
         </w:tc>
       </w:tr>
     </w:tbl>
@@ -7486,6 +7823,172 @@
           </w:p>
         </w:tc>
       </w:tr>
+      <w:tr>
+        <w:tc>
+          <w:tcPr>
+            <w:tcW w:w="2830" w:type="dxa"/>
+          </w:tcPr>
+          <w:p>
+            <w:r>
+              <w:lastRenderedPageBreak/>
+              <w:t xml:space="preserve">Ordering system errors </w:t>
+            </w:r>
+          </w:p>
+        </w:tc>
+        <w:tc>
+          <w:tcPr>
+            <w:tcW w:w="6096" w:type="dxa"/>
+          </w:tcPr>
+          <w:p>
+            <w:r>
+              <w:t xml:space="preserve">Thorough testing of </w:t>
+            </w:r>
+            <w:r>
+              <w:t>ordering</w:t>
+            </w:r>
+            <w:r>
+              <w:t xml:space="preserve"> logic and validation before launch. </w:t>
+            </w:r>
+            <w:r>
+              <w:t>Admin</w:t>
+            </w:r>
+            <w:r>
+              <w:t xml:space="preserve"> able to change </w:t>
+            </w:r>
+            <w:r>
+              <w:t xml:space="preserve">ordering </w:t>
+            </w:r>
+            <w:r>
+              <w:t xml:space="preserve">details from the </w:t>
+            </w:r>
+            <w:r>
+              <w:t>back end</w:t>
+            </w:r>
+            <w:r>
+              <w:t>.</w:t>
+            </w:r>
+          </w:p>
+        </w:tc>
+      </w:tr>
+      <w:tr>
+        <w:tc>
+          <w:tcPr>
+            <w:tcW w:w="2830" w:type="dxa"/>
+          </w:tcPr>
+          <w:p>
+            <w:r>
+              <w:t xml:space="preserve">Back-end access by unauthorised users </w:t>
+            </w:r>
+          </w:p>
+        </w:tc>
+        <w:tc>
+          <w:tcPr>
+            <w:tcW w:w="6096" w:type="dxa"/>
+          </w:tcPr>
+          <w:p>
+            <w:r>
+              <w:t>Implementing role-based access and two factor authorisations for users</w:t>
+            </w:r>
+            <w:r>
+              <w:t>.</w:t>
+            </w:r>
+          </w:p>
+        </w:tc>
+      </w:tr>
+      <w:tr>
+        <w:tc>
+          <w:tcPr>
+            <w:tcW w:w="2830" w:type="dxa"/>
+          </w:tcPr>
+          <w:p>
+            <w:r>
+              <w:t>Payment provider not working</w:t>
+            </w:r>
+          </w:p>
+        </w:tc>
+        <w:tc>
+          <w:tcPr>
+            <w:tcW w:w="6096" w:type="dxa"/>
+          </w:tcPr>
+          <w:p>
+            <w:r>
+              <w:t xml:space="preserve">Monitoring payment provider errors and including other payment providers </w:t>
+            </w:r>
+            <w:r>
+              <w:t>in case</w:t>
+            </w:r>
+            <w:r>
+              <w:t xml:space="preserve"> one does not work.</w:t>
+            </w:r>
+          </w:p>
+        </w:tc>
+      </w:tr>
+      <w:tr>
+        <w:tc>
+          <w:tcPr>
+            <w:tcW w:w="2830" w:type="dxa"/>
+          </w:tcPr>
+          <w:p>
+            <w:r>
+              <w:t>Producers adding wrong product details</w:t>
+            </w:r>
+          </w:p>
+        </w:tc>
+        <w:tc>
+          <w:tcPr>
+            <w:tcW w:w="6096" w:type="dxa"/>
+          </w:tcPr>
+          <w:p>
+            <w:r>
+              <w:t>Input validation for incorrect numerical data. Edit button to edit details. Confirmation message showing the product details before they are published to the website.</w:t>
+            </w:r>
+          </w:p>
+        </w:tc>
+      </w:tr>
+      <w:tr>
+        <w:tc>
+          <w:tcPr>
+            <w:tcW w:w="2830" w:type="dxa"/>
+          </w:tcPr>
+          <w:p>
+            <w:r>
+              <w:t>Incorrect stock and availability</w:t>
+            </w:r>
+          </w:p>
+        </w:tc>
+        <w:tc>
+          <w:tcPr>
+            <w:tcW w:w="6096" w:type="dxa"/>
+          </w:tcPr>
+          <w:p>
+            <w:r>
+              <w:t>Real-time stock updates sent to producers. Automatic stock reduction after an order is approved. Notifications sent to producers when stock is low.</w:t>
+            </w:r>
+          </w:p>
+        </w:tc>
+      </w:tr>
+      <w:tr>
+        <w:tc>
+          <w:tcPr>
+            <w:tcW w:w="2830" w:type="dxa"/>
+          </w:tcPr>
+          <w:p>
+            <w:r>
+              <w:t>Producer struggling to adopt using the dashboard</w:t>
+            </w:r>
+          </w:p>
+        </w:tc>
+        <w:tc>
+          <w:tcPr>
+            <w:tcW w:w="6096" w:type="dxa"/>
+          </w:tcPr>
+          <w:p>
+            <w:r>
+              <w:t>Providing the producers with a guidance or tutorial on how to use the website.</w:t>
+            </w:r>
+          </w:p>
+        </w:tc>
+      </w:tr>
     </w:tbl>
     <w:p/>
     <w:p>
@@ -7615,13 +8118,27 @@
           <w:tcPr>
             <w:tcW w:w="4508" w:type="dxa"/>
           </w:tcPr>
-          <w:p/>
+          <w:p>
+            <w:r>
+              <w:t>Payment Services Regulations 2017</w:t>
+            </w:r>
+          </w:p>
         </w:tc>
         <w:tc>
           <w:tcPr>
             <w:tcW w:w="4508" w:type="dxa"/>
           </w:tcPr>
-          <w:p/>
+          <w:p>
+            <w:r>
+              <w:t xml:space="preserve">To comply, the solution will use external payment providers as they already have secure ways to process payments, which comply with global regulations regarding payment processing. Furthermore, external payment providers will be used since it is industry </w:t>
+            </w:r>
+            <w:r>
+              <w:t>standard,</w:t>
+            </w:r>
+            <w:r>
+              <w:t xml:space="preserve"> and they are trusted by many businesses.</w:t>
+            </w:r>
+          </w:p>
         </w:tc>
       </w:tr>
       <w:tr>
@@ -7629,13 +8146,42 @@
           <w:tcPr>
             <w:tcW w:w="4508" w:type="dxa"/>
           </w:tcPr>
-          <w:p/>
+          <w:p>
+            <w:r>
+              <w:t>Food Information Regulations 2014 and Food Safety Act 1990</w:t>
+            </w:r>
+          </w:p>
         </w:tc>
         <w:tc>
           <w:tcPr>
             <w:tcW w:w="4508" w:type="dxa"/>
           </w:tcPr>
-          <w:p/>
+          <w:p>
+            <w:r>
+              <w:t xml:space="preserve">This can be done by showing the allergies information on the </w:t>
+            </w:r>
+            <w:r>
+              <w:t>products</w:t>
+            </w:r>
+            <w:r>
+              <w:t xml:space="preserve"> page and</w:t>
+            </w:r>
+            <w:r>
+              <w:t xml:space="preserve"> avoid misleading </w:t>
+            </w:r>
+            <w:r>
+              <w:t>product</w:t>
+            </w:r>
+            <w:r>
+              <w:t xml:space="preserve"> descriptions by regularly auditing the </w:t>
+            </w:r>
+            <w:r>
+              <w:t xml:space="preserve">products </w:t>
+            </w:r>
+            <w:r>
+              <w:t>information.</w:t>
+            </w:r>
+          </w:p>
         </w:tc>
       </w:tr>
       <w:tr>
@@ -9154,6 +9700,92 @@
     </w:lvl>
   </w:abstractNum>
   <w:abstractNum w:abstractNumId="13" w15:restartNumberingAfterBreak="0">
+    <w:nsid w:val="271A4505"/>
+    <w:multiLevelType w:val="hybridMultilevel"/>
+    <w:tmpl w:val="28DE29D2"/>
+    <w:lvl w:ilvl="0" w:tplc="0809000F">
+      <w:start w:val="1"/>
+      <w:numFmt w:val="decimal"/>
+      <w:lvlText w:val="%1."/>
+      <w:lvlJc w:val="left"/>
+      <w:pPr>
+        <w:ind w:left="720" w:hanging="360"/>
+      </w:pPr>
+    </w:lvl>
+    <w:lvl w:ilvl="1" w:tplc="08090019" w:tentative="1">
+      <w:start w:val="1"/>
+      <w:numFmt w:val="lowerLetter"/>
+      <w:lvlText w:val="%2."/>
+      <w:lvlJc w:val="left"/>
+      <w:pPr>
+        <w:ind w:left="1440" w:hanging="360"/>
+      </w:pPr>
+    </w:lvl>
+    <w:lvl w:ilvl="2" w:tplc="0809001B" w:tentative="1">
+      <w:start w:val="1"/>
+      <w:numFmt w:val="lowerRoman"/>
+      <w:lvlText w:val="%3."/>
+      <w:lvlJc w:val="right"/>
+      <w:pPr>
+        <w:ind w:left="2160" w:hanging="180"/>
+      </w:pPr>
+    </w:lvl>
+    <w:lvl w:ilvl="3" w:tplc="0809000F" w:tentative="1">
+      <w:start w:val="1"/>
+      <w:numFmt w:val="decimal"/>
+      <w:lvlText w:val="%4."/>
+      <w:lvlJc w:val="left"/>
+      <w:pPr>
+        <w:ind w:left="2880" w:hanging="360"/>
+      </w:pPr>
+    </w:lvl>
+    <w:lvl w:ilvl="4" w:tplc="08090019" w:tentative="1">
+      <w:start w:val="1"/>
+      <w:numFmt w:val="lowerLetter"/>
+      <w:lvlText w:val="%5."/>
+      <w:lvlJc w:val="left"/>
+      <w:pPr>
+        <w:ind w:left="3600" w:hanging="360"/>
+      </w:pPr>
+    </w:lvl>
+    <w:lvl w:ilvl="5" w:tplc="0809001B" w:tentative="1">
+      <w:start w:val="1"/>
+      <w:numFmt w:val="lowerRoman"/>
+      <w:lvlText w:val="%6."/>
+      <w:lvlJc w:val="right"/>
+      <w:pPr>
+        <w:ind w:left="4320" w:hanging="180"/>
+      </w:pPr>
+    </w:lvl>
+    <w:lvl w:ilvl="6" w:tplc="0809000F" w:tentative="1">
+      <w:start w:val="1"/>
+      <w:numFmt w:val="decimal"/>
+      <w:lvlText w:val="%7."/>
+      <w:lvlJc w:val="left"/>
+      <w:pPr>
+        <w:ind w:left="5040" w:hanging="360"/>
+      </w:pPr>
+    </w:lvl>
+    <w:lvl w:ilvl="7" w:tplc="08090019" w:tentative="1">
+      <w:start w:val="1"/>
+      <w:numFmt w:val="lowerLetter"/>
+      <w:lvlText w:val="%8."/>
+      <w:lvlJc w:val="left"/>
+      <w:pPr>
+        <w:ind w:left="5760" w:hanging="360"/>
+      </w:pPr>
+    </w:lvl>
+    <w:lvl w:ilvl="8" w:tplc="0809001B" w:tentative="1">
+      <w:start w:val="1"/>
+      <w:numFmt w:val="lowerRoman"/>
+      <w:lvlText w:val="%9."/>
+      <w:lvlJc w:val="right"/>
+      <w:pPr>
+        <w:ind w:left="6480" w:hanging="180"/>
+      </w:pPr>
+    </w:lvl>
+  </w:abstractNum>
+  <w:abstractNum w:abstractNumId="14" w15:restartNumberingAfterBreak="0">
     <w:nsid w:val="285E6777"/>
     <w:multiLevelType w:val="hybridMultilevel"/>
     <w:tmpl w:val="34B436EA"/>
@@ -9239,7 +9871,7 @@
       </w:pPr>
     </w:lvl>
   </w:abstractNum>
-  <w:abstractNum w:abstractNumId="14" w15:restartNumberingAfterBreak="0">
+  <w:abstractNum w:abstractNumId="15" w15:restartNumberingAfterBreak="0">
     <w:nsid w:val="2B2C7C13"/>
     <w:multiLevelType w:val="hybridMultilevel"/>
     <w:tmpl w:val="02968A02"/>
@@ -9351,7 +9983,7 @@
       </w:rPr>
     </w:lvl>
   </w:abstractNum>
-  <w:abstractNum w:abstractNumId="15" w15:restartNumberingAfterBreak="0">
+  <w:abstractNum w:abstractNumId="16" w15:restartNumberingAfterBreak="0">
     <w:nsid w:val="342A6224"/>
     <w:multiLevelType w:val="hybridMultilevel"/>
     <w:tmpl w:val="B69638BC"/>
@@ -9464,7 +10096,7 @@
       </w:rPr>
     </w:lvl>
   </w:abstractNum>
-  <w:abstractNum w:abstractNumId="16" w15:restartNumberingAfterBreak="0">
+  <w:abstractNum w:abstractNumId="17" w15:restartNumberingAfterBreak="0">
     <w:nsid w:val="3751532F"/>
     <w:multiLevelType w:val="hybridMultilevel"/>
     <w:tmpl w:val="D8B64EF0"/>
@@ -9577,7 +10209,7 @@
       </w:rPr>
     </w:lvl>
   </w:abstractNum>
-  <w:abstractNum w:abstractNumId="17" w15:restartNumberingAfterBreak="0">
+  <w:abstractNum w:abstractNumId="18" w15:restartNumberingAfterBreak="0">
     <w:nsid w:val="3A934B39"/>
     <w:multiLevelType w:val="hybridMultilevel"/>
     <w:tmpl w:val="15B07FBC"/>
@@ -9663,7 +10295,7 @@
       </w:pPr>
     </w:lvl>
   </w:abstractNum>
-  <w:abstractNum w:abstractNumId="18" w15:restartNumberingAfterBreak="0">
+  <w:abstractNum w:abstractNumId="19" w15:restartNumberingAfterBreak="0">
     <w:nsid w:val="42447CAB"/>
     <w:multiLevelType w:val="hybridMultilevel"/>
     <w:tmpl w:val="1D2685E2"/>
@@ -9752,7 +10384,7 @@
       </w:pPr>
     </w:lvl>
   </w:abstractNum>
-  <w:abstractNum w:abstractNumId="19" w15:restartNumberingAfterBreak="0">
+  <w:abstractNum w:abstractNumId="20" w15:restartNumberingAfterBreak="0">
     <w:nsid w:val="42E34D9B"/>
     <w:multiLevelType w:val="hybridMultilevel"/>
     <w:tmpl w:val="F4BC7552"/>
@@ -9841,7 +10473,7 @@
       </w:pPr>
     </w:lvl>
   </w:abstractNum>
-  <w:abstractNum w:abstractNumId="20" w15:restartNumberingAfterBreak="0">
+  <w:abstractNum w:abstractNumId="21" w15:restartNumberingAfterBreak="0">
     <w:nsid w:val="44E2447E"/>
     <w:multiLevelType w:val="hybridMultilevel"/>
     <w:tmpl w:val="B290E53A"/>
@@ -9954,7 +10586,96 @@
       </w:rPr>
     </w:lvl>
   </w:abstractNum>
-  <w:abstractNum w:abstractNumId="21" w15:restartNumberingAfterBreak="0">
+  <w:abstractNum w:abstractNumId="22" w15:restartNumberingAfterBreak="0">
+    <w:nsid w:val="46C83559"/>
+    <w:multiLevelType w:val="hybridMultilevel"/>
+    <w:tmpl w:val="28F21560"/>
+    <w:lvl w:ilvl="0" w:tplc="0809000F">
+      <w:start w:val="1"/>
+      <w:numFmt w:val="decimal"/>
+      <w:lvlText w:val="%1."/>
+      <w:lvlJc w:val="left"/>
+      <w:pPr>
+        <w:ind w:left="720" w:hanging="360"/>
+      </w:pPr>
+      <w:rPr>
+        <w:rFonts w:hint="default"/>
+      </w:rPr>
+    </w:lvl>
+    <w:lvl w:ilvl="1" w:tplc="08090019" w:tentative="1">
+      <w:start w:val="1"/>
+      <w:numFmt w:val="lowerLetter"/>
+      <w:lvlText w:val="%2."/>
+      <w:lvlJc w:val="left"/>
+      <w:pPr>
+        <w:ind w:left="1440" w:hanging="360"/>
+      </w:pPr>
+    </w:lvl>
+    <w:lvl w:ilvl="2" w:tplc="0809001B" w:tentative="1">
+      <w:start w:val="1"/>
+      <w:numFmt w:val="lowerRoman"/>
+      <w:lvlText w:val="%3."/>
+      <w:lvlJc w:val="right"/>
+      <w:pPr>
+        <w:ind w:left="2160" w:hanging="180"/>
+      </w:pPr>
+    </w:lvl>
+    <w:lvl w:ilvl="3" w:tplc="0809000F" w:tentative="1">
+      <w:start w:val="1"/>
+      <w:numFmt w:val="decimal"/>
+      <w:lvlText w:val="%4."/>
+      <w:lvlJc w:val="left"/>
+      <w:pPr>
+        <w:ind w:left="2880" w:hanging="360"/>
+      </w:pPr>
+    </w:lvl>
+    <w:lvl w:ilvl="4" w:tplc="08090019" w:tentative="1">
+      <w:start w:val="1"/>
+      <w:numFmt w:val="lowerLetter"/>
+      <w:lvlText w:val="%5."/>
+      <w:lvlJc w:val="left"/>
+      <w:pPr>
+        <w:ind w:left="3600" w:hanging="360"/>
+      </w:pPr>
+    </w:lvl>
+    <w:lvl w:ilvl="5" w:tplc="0809001B" w:tentative="1">
+      <w:start w:val="1"/>
+      <w:numFmt w:val="lowerRoman"/>
+      <w:lvlText w:val="%6."/>
+      <w:lvlJc w:val="right"/>
+      <w:pPr>
+        <w:ind w:left="4320" w:hanging="180"/>
+      </w:pPr>
+    </w:lvl>
+    <w:lvl w:ilvl="6" w:tplc="0809000F" w:tentative="1">
+      <w:start w:val="1"/>
+      <w:numFmt w:val="decimal"/>
+      <w:lvlText w:val="%7."/>
+      <w:lvlJc w:val="left"/>
+      <w:pPr>
+        <w:ind w:left="5040" w:hanging="360"/>
+      </w:pPr>
+    </w:lvl>
+    <w:lvl w:ilvl="7" w:tplc="08090019" w:tentative="1">
+      <w:start w:val="1"/>
+      <w:numFmt w:val="lowerLetter"/>
+      <w:lvlText w:val="%8."/>
+      <w:lvlJc w:val="left"/>
+      <w:pPr>
+        <w:ind w:left="5760" w:hanging="360"/>
+      </w:pPr>
+    </w:lvl>
+    <w:lvl w:ilvl="8" w:tplc="0809001B" w:tentative="1">
+      <w:start w:val="1"/>
+      <w:numFmt w:val="lowerRoman"/>
+      <w:lvlText w:val="%9."/>
+      <w:lvlJc w:val="right"/>
+      <w:pPr>
+        <w:ind w:left="6480" w:hanging="180"/>
+      </w:pPr>
+    </w:lvl>
+  </w:abstractNum>
+  <w:abstractNum w:abstractNumId="23" w15:restartNumberingAfterBreak="0">
     <w:nsid w:val="47D279C7"/>
     <w:multiLevelType w:val="hybridMultilevel"/>
     <w:tmpl w:val="F684E67E"/>
@@ -10043,7 +10764,7 @@
       </w:pPr>
     </w:lvl>
   </w:abstractNum>
-  <w:abstractNum w:abstractNumId="22" w15:restartNumberingAfterBreak="0">
+  <w:abstractNum w:abstractNumId="24" w15:restartNumberingAfterBreak="0">
     <w:nsid w:val="58EB02EA"/>
     <w:multiLevelType w:val="hybridMultilevel"/>
     <w:tmpl w:val="DE54E472"/>
@@ -10156,7 +10877,7 @@
       </w:rPr>
     </w:lvl>
   </w:abstractNum>
-  <w:abstractNum w:abstractNumId="23" w15:restartNumberingAfterBreak="0">
+  <w:abstractNum w:abstractNumId="25" w15:restartNumberingAfterBreak="0">
     <w:nsid w:val="5BFB78F5"/>
     <w:multiLevelType w:val="hybridMultilevel"/>
     <w:tmpl w:val="40E281F6"/>
@@ -10269,7 +10990,7 @@
       </w:rPr>
     </w:lvl>
   </w:abstractNum>
-  <w:abstractNum w:abstractNumId="24" w15:restartNumberingAfterBreak="0">
+  <w:abstractNum w:abstractNumId="26" w15:restartNumberingAfterBreak="0">
     <w:nsid w:val="5C92227C"/>
     <w:multiLevelType w:val="hybridMultilevel"/>
     <w:tmpl w:val="557E57FE"/>
@@ -10381,7 +11102,7 @@
       </w:rPr>
     </w:lvl>
   </w:abstractNum>
-  <w:abstractNum w:abstractNumId="25" w15:restartNumberingAfterBreak="0">
+  <w:abstractNum w:abstractNumId="27" w15:restartNumberingAfterBreak="0">
     <w:nsid w:val="649D2C19"/>
     <w:multiLevelType w:val="hybridMultilevel"/>
     <w:tmpl w:val="F2E01624"/>
@@ -10494,7 +11215,7 @@
       </w:rPr>
     </w:lvl>
   </w:abstractNum>
-  <w:abstractNum w:abstractNumId="26" w15:restartNumberingAfterBreak="0">
+  <w:abstractNum w:abstractNumId="28" w15:restartNumberingAfterBreak="0">
     <w:nsid w:val="6854278D"/>
     <w:multiLevelType w:val="hybridMultilevel"/>
     <w:tmpl w:val="AA62088E"/>
@@ -10583,7 +11304,7 @@
       </w:pPr>
     </w:lvl>
   </w:abstractNum>
-  <w:abstractNum w:abstractNumId="27" w15:restartNumberingAfterBreak="0">
+  <w:abstractNum w:abstractNumId="29" w15:restartNumberingAfterBreak="0">
     <w:nsid w:val="6AD41083"/>
     <w:multiLevelType w:val="hybridMultilevel"/>
     <w:tmpl w:val="4F68D04A"/>
@@ -10669,7 +11390,7 @@
       </w:pPr>
     </w:lvl>
   </w:abstractNum>
-  <w:abstractNum w:abstractNumId="28" w15:restartNumberingAfterBreak="0">
+  <w:abstractNum w:abstractNumId="30" w15:restartNumberingAfterBreak="0">
     <w:nsid w:val="6F9B684D"/>
     <w:multiLevelType w:val="hybridMultilevel"/>
     <w:tmpl w:val="2A962156"/>
@@ -10782,7 +11503,7 @@
       </w:rPr>
     </w:lvl>
   </w:abstractNum>
-  <w:abstractNum w:abstractNumId="29" w15:restartNumberingAfterBreak="0">
+  <w:abstractNum w:abstractNumId="31" w15:restartNumberingAfterBreak="0">
     <w:nsid w:val="77485005"/>
     <w:multiLevelType w:val="hybridMultilevel"/>
     <w:tmpl w:val="1D54A7B0"/>
@@ -10895,7 +11616,7 @@
       </w:rPr>
     </w:lvl>
   </w:abstractNum>
-  <w:abstractNum w:abstractNumId="30" w15:restartNumberingAfterBreak="0">
+  <w:abstractNum w:abstractNumId="32" w15:restartNumberingAfterBreak="0">
     <w:nsid w:val="77A26102"/>
     <w:multiLevelType w:val="hybridMultilevel"/>
     <w:tmpl w:val="A02892DE"/>
@@ -10981,7 +11702,7 @@
       </w:pPr>
     </w:lvl>
   </w:abstractNum>
-  <w:abstractNum w:abstractNumId="31" w15:restartNumberingAfterBreak="0">
+  <w:abstractNum w:abstractNumId="33" w15:restartNumberingAfterBreak="0">
     <w:nsid w:val="79254375"/>
     <w:multiLevelType w:val="hybridMultilevel"/>
     <w:tmpl w:val="57E8B0D4"/>
@@ -11094,7 +11815,7 @@
       </w:rPr>
     </w:lvl>
   </w:abstractNum>
-  <w:abstractNum w:abstractNumId="32" w15:restartNumberingAfterBreak="0">
+  <w:abstractNum w:abstractNumId="34" w15:restartNumberingAfterBreak="0">
     <w:nsid w:val="79E94091"/>
     <w:multiLevelType w:val="hybridMultilevel"/>
     <w:tmpl w:val="1D2685E2"/>
@@ -11187,25 +11908,25 @@
     <w:abstractNumId w:val="4"/>
   </w:num>
   <w:num w:numId="2" w16cid:durableId="873617365">
-    <w:abstractNumId w:val="14"/>
+    <w:abstractNumId w:val="15"/>
   </w:num>
   <w:num w:numId="3" w16cid:durableId="415858473">
     <w:abstractNumId w:val="8"/>
   </w:num>
   <w:num w:numId="4" w16cid:durableId="1934240272">
-    <w:abstractNumId w:val="27"/>
+    <w:abstractNumId w:val="29"/>
   </w:num>
   <w:num w:numId="5" w16cid:durableId="500319591">
     <w:abstractNumId w:val="10"/>
   </w:num>
   <w:num w:numId="6" w16cid:durableId="1953244164">
-    <w:abstractNumId w:val="25"/>
+    <w:abstractNumId w:val="27"/>
   </w:num>
   <w:num w:numId="7" w16cid:durableId="1272973944">
     <w:abstractNumId w:val="5"/>
   </w:num>
   <w:num w:numId="8" w16cid:durableId="296837842">
-    <w:abstractNumId w:val="24"/>
+    <w:abstractNumId w:val="26"/>
   </w:num>
   <w:num w:numId="9" w16cid:durableId="1612740194">
     <w:abstractNumId w:val="7"/>
@@ -11217,16 +11938,16 @@
     <w:abstractNumId w:val="3"/>
   </w:num>
   <w:num w:numId="12" w16cid:durableId="57019460">
-    <w:abstractNumId w:val="17"/>
+    <w:abstractNumId w:val="18"/>
   </w:num>
   <w:num w:numId="13" w16cid:durableId="1135102731">
     <w:abstractNumId w:val="12"/>
   </w:num>
   <w:num w:numId="14" w16cid:durableId="2040273535">
-    <w:abstractNumId w:val="13"/>
+    <w:abstractNumId w:val="14"/>
   </w:num>
   <w:num w:numId="15" w16cid:durableId="2078088890">
-    <w:abstractNumId w:val="19"/>
+    <w:abstractNumId w:val="20"/>
   </w:num>
   <w:num w:numId="16" w16cid:durableId="224148914">
     <w:abstractNumId w:val="2"/>
@@ -11235,52 +11956,58 @@
     <w:abstractNumId w:val="9"/>
   </w:num>
   <w:num w:numId="18" w16cid:durableId="1168524478">
-    <w:abstractNumId w:val="29"/>
+    <w:abstractNumId w:val="31"/>
   </w:num>
   <w:num w:numId="19" w16cid:durableId="1477914169">
-    <w:abstractNumId w:val="26"/>
+    <w:abstractNumId w:val="28"/>
   </w:num>
   <w:num w:numId="20" w16cid:durableId="1623457808">
     <w:abstractNumId w:val="11"/>
   </w:num>
   <w:num w:numId="21" w16cid:durableId="1264651575">
-    <w:abstractNumId w:val="18"/>
+    <w:abstractNumId w:val="19"/>
   </w:num>
   <w:num w:numId="22" w16cid:durableId="671879580">
-    <w:abstractNumId w:val="21"/>
+    <w:abstractNumId w:val="23"/>
   </w:num>
   <w:num w:numId="23" w16cid:durableId="850948606">
-    <w:abstractNumId w:val="32"/>
+    <w:abstractNumId w:val="34"/>
   </w:num>
   <w:num w:numId="24" w16cid:durableId="440616153">
     <w:abstractNumId w:val="1"/>
   </w:num>
   <w:num w:numId="25" w16cid:durableId="1892769113">
-    <w:abstractNumId w:val="28"/>
+    <w:abstractNumId w:val="30"/>
   </w:num>
   <w:num w:numId="26" w16cid:durableId="1310551058">
-    <w:abstractNumId w:val="20"/>
+    <w:abstractNumId w:val="21"/>
   </w:num>
   <w:num w:numId="27" w16cid:durableId="937251674">
-    <w:abstractNumId w:val="30"/>
+    <w:abstractNumId w:val="32"/>
   </w:num>
   <w:num w:numId="28" w16cid:durableId="1176579910">
-    <w:abstractNumId w:val="23"/>
+    <w:abstractNumId w:val="25"/>
   </w:num>
   <w:num w:numId="29" w16cid:durableId="564145885">
     <w:abstractNumId w:val="0"/>
   </w:num>
   <w:num w:numId="30" w16cid:durableId="2037729497">
-    <w:abstractNumId w:val="31"/>
+    <w:abstractNumId w:val="33"/>
   </w:num>
   <w:num w:numId="31" w16cid:durableId="1972712446">
-    <w:abstractNumId w:val="22"/>
+    <w:abstractNumId w:val="24"/>
   </w:num>
   <w:num w:numId="32" w16cid:durableId="325481554">
+    <w:abstractNumId w:val="17"/>
+  </w:num>
+  <w:num w:numId="33" w16cid:durableId="1457026527">
     <w:abstractNumId w:val="16"/>
   </w:num>
-  <w:num w:numId="33" w16cid:durableId="1457026527">
-    <w:abstractNumId w:val="15"/>
+  <w:num w:numId="34" w16cid:durableId="722021569">
+    <w:abstractNumId w:val="13"/>
+  </w:num>
+  <w:num w:numId="35" w16cid:durableId="1272585531">
+    <w:abstractNumId w:val="22"/>
   </w:num>
 </w:numbering>
 </file>
@@ -11892,7 +12619,6 @@
   <w:style w:type="character" w:default="1" w:styleId="DefaultParagraphFont">
     <w:name w:val="Default Paragraph Font"/>
     <w:uiPriority w:val="1"/>
-    <w:semiHidden/>
     <w:unhideWhenUsed/>
   </w:style>
   <w:style w:type="table" w:default="1" w:styleId="TableNormal">
@@ -12604,9 +13330,12 @@
     <w:rsid w:val="001A42E8"/>
     <w:rsid w:val="002544AF"/>
     <w:rsid w:val="00344067"/>
+    <w:rsid w:val="00547CE8"/>
     <w:rsid w:val="005962A3"/>
     <w:rsid w:val="005B51A2"/>
+    <w:rsid w:val="00640F7E"/>
     <w:rsid w:val="0066102B"/>
+    <w:rsid w:val="00687002"/>
     <w:rsid w:val="006B5931"/>
     <w:rsid w:val="007C1B1A"/>
     <w:rsid w:val="00866A9B"/>
@@ -13385,7 +14114,12 @@
 </file>
 
 <file path=customXml/item1.xml><?xml version="1.0" encoding="utf-8"?>
-<b:Sources xmlns:b="http://schemas.openxmlformats.org/officeDocument/2006/bibliography" xmlns="http://schemas.openxmlformats.org/officeDocument/2006/bibliography" SelectedStyle="\APASixthEditionOfficeOnline.xsl" StyleName="APA" Version="6"/>
+<?mso-contentType ?>
+<FormTemplates xmlns="http://schemas.microsoft.com/sharepoint/v3/contenttype/forms">
+  <Display>DocumentLibraryForm</Display>
+  <Edit>DocumentLibraryForm</Edit>
+  <New>DocumentLibraryForm</New>
+</FormTemplates>
 </file>
 
 <file path=customXml/item2.xml><?xml version="1.0" encoding="utf-8"?>
@@ -13397,12 +14131,7 @@
 </file>
 
 <file path=customXml/item3.xml><?xml version="1.0" encoding="utf-8"?>
-<?mso-contentType ?>
-<FormTemplates xmlns="http://schemas.microsoft.com/sharepoint/v3/contenttype/forms">
-  <Display>DocumentLibraryForm</Display>
-  <Edit>DocumentLibraryForm</Edit>
-  <New>DocumentLibraryForm</New>
-</FormTemplates>
+<b:Sources xmlns:b="http://schemas.openxmlformats.org/officeDocument/2006/bibliography" xmlns="http://schemas.openxmlformats.org/officeDocument/2006/bibliography" SelectedStyle="\APASixthEditionOfficeOnline.xsl" StyleName="APA" Version="6"/>
 </file>
 
 <file path=customXml/item4.xml><?xml version="1.0" encoding="utf-8"?>
@@ -13592,9 +14321,9 @@
 </file>
 
 <file path=customXml/itemProps1.xml><?xml version="1.0" encoding="utf-8"?>
-<ds:datastoreItem xmlns:ds="http://schemas.openxmlformats.org/officeDocument/2006/customXml" ds:itemID="{0D881E5E-1EED-4410-9E84-B313F13A8E11}">
+<ds:datastoreItem xmlns:ds="http://schemas.openxmlformats.org/officeDocument/2006/customXml" ds:itemID="{21DAEC36-CEDD-4710-8B47-55AB3774ECF8}">
   <ds:schemaRefs>
-    <ds:schemaRef ds:uri="http://schemas.openxmlformats.org/officeDocument/2006/bibliography"/>
+    <ds:schemaRef ds:uri="http://schemas.microsoft.com/sharepoint/v3/contenttype/forms"/>
   </ds:schemaRefs>
 </ds:datastoreItem>
 </file>
@@ -13610,9 +14339,9 @@
 </file>
 
 <file path=customXml/itemProps3.xml><?xml version="1.0" encoding="utf-8"?>
-<ds:datastoreItem xmlns:ds="http://schemas.openxmlformats.org/officeDocument/2006/customXml" ds:itemID="{21DAEC36-CEDD-4710-8B47-55AB3774ECF8}">
+<ds:datastoreItem xmlns:ds="http://schemas.openxmlformats.org/officeDocument/2006/customXml" ds:itemID="{0D881E5E-1EED-4410-9E84-B313F13A8E11}">
   <ds:schemaRefs>
-    <ds:schemaRef ds:uri="http://schemas.microsoft.com/sharepoint/v3/contenttype/forms"/>
+    <ds:schemaRef ds:uri="http://schemas.openxmlformats.org/officeDocument/2006/bibliography"/>
   </ds:schemaRefs>
 </ds:datastoreItem>
 </file>

</xml_diff>